<commit_message>
finished response to reviewers
</commit_message>
<xml_diff>
--- a/Manuscript/Ecological Modelling/Third submission/Response.docx
+++ b/Manuscript/Ecological Modelling/Third submission/Response.docx
@@ -32,7 +32,7 @@
           <w:noProof/>
           <w:sz w:val="20"/>
         </w:rPr>
-        <w:t>January 16, 2026</w:t>
+        <w:t>February 16, 2026</w:t>
       </w:r>
       <w:r>
         <w:rPr>
@@ -310,49 +310,121 @@
         <w:rPr>
           <w:sz w:val="20"/>
         </w:rPr>
-        <w:t>I have revised the manuscript according to the reviewers’ comments</w:t>
-      </w:r>
-      <w:r>
-        <w:rPr>
-          <w:sz w:val="20"/>
-        </w:rPr>
-        <w:t xml:space="preserve">. My </w:t>
-      </w:r>
-      <w:r>
-        <w:rPr>
-          <w:sz w:val="20"/>
-        </w:rPr>
-        <w:t>response and</w:t>
-      </w:r>
-      <w:r>
-        <w:rPr>
-          <w:sz w:val="20"/>
-        </w:rPr>
-        <w:t>,</w:t>
+        <w:t xml:space="preserve">Inspired by the reviewers’ constructive comments, </w:t>
+      </w:r>
+      <w:r>
+        <w:rPr>
+          <w:sz w:val="20"/>
+        </w:rPr>
+        <w:t xml:space="preserve">I have </w:t>
+      </w:r>
+      <w:r>
+        <w:rPr>
+          <w:sz w:val="20"/>
+        </w:rPr>
+        <w:t xml:space="preserve">completely </w:t>
+      </w:r>
+      <w:r>
+        <w:rPr>
+          <w:sz w:val="20"/>
+        </w:rPr>
+        <w:t>reanalysed each case study and rewritten</w:t>
+      </w:r>
+      <w:r>
+        <w:rPr>
+          <w:sz w:val="20"/>
+        </w:rPr>
+        <w:t xml:space="preserve"> the manuscript</w:t>
+      </w:r>
+      <w:r>
+        <w:rPr>
+          <w:sz w:val="20"/>
+        </w:rPr>
+        <w:t xml:space="preserve">. </w:t>
+      </w:r>
+      <w:r>
+        <w:rPr>
+          <w:sz w:val="20"/>
+        </w:rPr>
+        <w:t xml:space="preserve">In addition to conceptual justification, I now provide empirical test results for each modelling choice. I have </w:t>
+      </w:r>
+      <w:r>
+        <w:rPr>
+          <w:sz w:val="20"/>
+        </w:rPr>
+        <w:t xml:space="preserve">also </w:t>
+      </w:r>
+      <w:r>
+        <w:rPr>
+          <w:sz w:val="20"/>
+        </w:rPr>
+        <w:t xml:space="preserve">added a </w:t>
+      </w:r>
+      <w:r>
+        <w:rPr>
+          <w:sz w:val="20"/>
+        </w:rPr>
+        <w:t>seventh</w:t>
+      </w:r>
+      <w:r>
+        <w:rPr>
+          <w:sz w:val="20"/>
+        </w:rPr>
+        <w:t xml:space="preserve"> case study and formally compare the new model to the conventional model for each. To prove the utility of this model </w:t>
+      </w:r>
+      <w:r>
+        <w:rPr>
+          <w:sz w:val="20"/>
+        </w:rPr>
+        <w:t>in</w:t>
+      </w:r>
+      <w:r>
+        <w:rPr>
+          <w:sz w:val="20"/>
+        </w:rPr>
+        <w:t xml:space="preserve"> meta-analys</w:t>
+      </w:r>
+      <w:r>
+        <w:rPr>
+          <w:sz w:val="20"/>
+        </w:rPr>
+        <w:t>i</w:t>
+      </w:r>
+      <w:r>
+        <w:rPr>
+          <w:sz w:val="20"/>
+        </w:rPr>
+        <w:t xml:space="preserve">s, I now explicitly include several multilevel model applications. </w:t>
+      </w:r>
+      <w:r>
+        <w:rPr>
+          <w:sz w:val="20"/>
+        </w:rPr>
+        <w:t xml:space="preserve">My </w:t>
+      </w:r>
+      <w:r>
+        <w:rPr>
+          <w:sz w:val="20"/>
+        </w:rPr>
+        <w:t xml:space="preserve">response </w:t>
+      </w:r>
+      <w:r>
+        <w:rPr>
+          <w:sz w:val="20"/>
+        </w:rPr>
+        <w:t xml:space="preserve">to reviewers </w:t>
+      </w:r>
+      <w:r>
+        <w:rPr>
+          <w:sz w:val="20"/>
+        </w:rPr>
+        <w:t>is</w:t>
       </w:r>
       <w:r>
         <w:rPr>
           <w:sz w:val="20"/>
         </w:rPr>
         <w:t xml:space="preserve"> </w:t>
-      </w:r>
-      <w:r>
-        <w:rPr>
-          <w:sz w:val="20"/>
-        </w:rPr>
-        <w:t xml:space="preserve">where relevant, </w:t>
-      </w:r>
-      <w:r>
-        <w:rPr>
-          <w:sz w:val="20"/>
-        </w:rPr>
-        <w:t xml:space="preserve">line numbers </w:t>
-      </w:r>
-      <w:r>
-        <w:rPr>
-          <w:sz w:val="20"/>
-        </w:rPr>
-        <w:t xml:space="preserve">pointing to changes are </w:t>
       </w:r>
       <w:r>
         <w:rPr>
@@ -429,26 +501,1086 @@
             <w:color w:val="auto"/>
             <w:sz w:val="20"/>
           </w:rPr>
-          <w:t>github.com/lukaseamus/limbodeco</w:t>
+          <w:t>github.com/</w:t>
+        </w:r>
+        <w:proofErr w:type="spellStart"/>
+        <w:r>
+          <w:rPr>
+            <w:rStyle w:val="Hyperlink"/>
+            <w:color w:val="auto"/>
+            <w:sz w:val="20"/>
+          </w:rPr>
+          <w:t>lukaseamus</w:t>
+        </w:r>
+        <w:proofErr w:type="spellEnd"/>
+        <w:r>
+          <w:rPr>
+            <w:rStyle w:val="Hyperlink"/>
+            <w:color w:val="auto"/>
+            <w:sz w:val="20"/>
+          </w:rPr>
+          <w:t>/</w:t>
+        </w:r>
+        <w:proofErr w:type="spellStart"/>
+        <w:r>
+          <w:rPr>
+            <w:rStyle w:val="Hyperlink"/>
+            <w:color w:val="auto"/>
+            <w:sz w:val="20"/>
+          </w:rPr>
+          <w:t>limbodeco</w:t>
+        </w:r>
+        <w:proofErr w:type="spellEnd"/>
+      </w:hyperlink>
+      <w:r>
+        <w:rPr>
+          <w:sz w:val="20"/>
+        </w:rPr>
+        <w:t xml:space="preserve"> </w:t>
+      </w:r>
+      <w:r>
+        <w:rPr>
+          <w:sz w:val="20"/>
+        </w:rPr>
+        <w:t>and I encourage you to pass these on to the reviewers.</w:t>
+      </w:r>
+      <w:r>
+        <w:rPr>
+          <w:sz w:val="20"/>
+        </w:rPr>
+        <w:t xml:space="preserve"> I would also be interested to connect with Reviewer #3 for further discussions.</w:t>
+      </w:r>
+    </w:p>
+    <w:p>
+      <w:pPr>
+        <w:jc w:val="left"/>
+        <w:rPr>
+          <w:color w:val="000000"/>
+          <w:sz w:val="20"/>
+        </w:rPr>
+      </w:pPr>
+    </w:p>
+    <w:p>
+      <w:pPr>
+        <w:jc w:val="left"/>
+        <w:rPr>
+          <w:color w:val="000000"/>
+          <w:sz w:val="20"/>
+        </w:rPr>
+      </w:pPr>
+      <w:r>
+        <w:rPr>
+          <w:b/>
+          <w:bCs/>
+          <w:color w:val="000000"/>
+          <w:sz w:val="20"/>
+        </w:rPr>
+        <w:t>Reviewer #2</w:t>
+      </w:r>
+      <w:r>
+        <w:rPr>
+          <w:color w:val="000000"/>
+          <w:sz w:val="20"/>
+        </w:rPr>
+        <w:t>:</w:t>
+      </w:r>
+      <w:r>
+        <w:rPr>
+          <w:color w:val="000000"/>
+          <w:sz w:val="20"/>
+        </w:rPr>
+        <w:br/>
+        <w:t>I think the paper is very well written, detailed, and well explained. The development of the equations is well structured. I think the manuscript is ideal for publication in the journal. I have minor comment:</w:t>
+      </w:r>
+      <w:r>
+        <w:rPr>
+          <w:color w:val="000000"/>
+          <w:sz w:val="20"/>
+        </w:rPr>
+        <w:br/>
+      </w:r>
+      <w:r>
+        <w:rPr>
+          <w:color w:val="000000"/>
+          <w:sz w:val="20"/>
+        </w:rPr>
+        <w:br/>
+        <w:t>Line 9: Are you sure this is the world's first mathematical model for macroalgal decomposition?</w:t>
+      </w:r>
+      <w:r>
+        <w:rPr>
+          <w:color w:val="000000"/>
+          <w:sz w:val="20"/>
+        </w:rPr>
+        <w:br/>
+      </w:r>
+    </w:p>
+    <w:p>
+      <w:pPr>
+        <w:jc w:val="left"/>
+        <w:rPr>
+          <w:i/>
+          <w:iCs/>
+          <w:color w:val="000000"/>
+          <w:sz w:val="20"/>
+        </w:rPr>
+      </w:pPr>
+      <w:r>
+        <w:rPr>
+          <w:i/>
+          <w:iCs/>
+          <w:color w:val="000000"/>
+          <w:sz w:val="20"/>
+        </w:rPr>
+        <w:t xml:space="preserve">Thank you. </w:t>
+      </w:r>
+      <w:r>
+        <w:rPr>
+          <w:i/>
+          <w:iCs/>
+          <w:color w:val="000000"/>
+          <w:sz w:val="20"/>
+        </w:rPr>
+        <w:t xml:space="preserve">This was also </w:t>
+      </w:r>
+      <w:r>
+        <w:rPr>
+          <w:i/>
+          <w:iCs/>
+          <w:color w:val="000000"/>
+          <w:sz w:val="20"/>
+        </w:rPr>
+        <w:t xml:space="preserve">noted by Reviewer #3. </w:t>
+      </w:r>
+      <w:r>
+        <w:rPr>
+          <w:i/>
+          <w:iCs/>
+          <w:color w:val="000000"/>
+          <w:sz w:val="20"/>
+        </w:rPr>
+        <w:t xml:space="preserve">While to the best of my knowledge this is indeed the first decomposition model specifically designed with macroalgae in mind, </w:t>
+      </w:r>
+      <w:r>
+        <w:rPr>
+          <w:i/>
+          <w:iCs/>
+          <w:color w:val="000000"/>
+          <w:sz w:val="20"/>
+        </w:rPr>
+        <w:t xml:space="preserve">I have </w:t>
+      </w:r>
+      <w:r>
+        <w:rPr>
+          <w:i/>
+          <w:iCs/>
+          <w:color w:val="000000"/>
+          <w:sz w:val="20"/>
+        </w:rPr>
+        <w:t>changed</w:t>
+      </w:r>
+      <w:r>
+        <w:rPr>
+          <w:i/>
+          <w:iCs/>
+          <w:color w:val="000000"/>
+          <w:sz w:val="20"/>
+        </w:rPr>
+        <w:t xml:space="preserve"> this statement</w:t>
+      </w:r>
+      <w:r>
+        <w:rPr>
+          <w:i/>
+          <w:iCs/>
+          <w:color w:val="000000"/>
+          <w:sz w:val="20"/>
+        </w:rPr>
+        <w:t xml:space="preserve"> to “</w:t>
+      </w:r>
+      <w:r>
+        <w:rPr>
+          <w:i/>
+          <w:iCs/>
+          <w:sz w:val="20"/>
+          <w:lang w:bidi="he-IL"/>
+        </w:rPr>
+        <w:t>a mathematical model of macroalgal decomposition”</w:t>
+      </w:r>
+      <w:r>
+        <w:rPr>
+          <w:i/>
+          <w:iCs/>
+          <w:color w:val="000000"/>
+          <w:sz w:val="20"/>
+        </w:rPr>
+        <w:t>.</w:t>
+      </w:r>
+    </w:p>
+    <w:p>
+      <w:pPr>
+        <w:jc w:val="left"/>
+        <w:rPr>
+          <w:i/>
+          <w:iCs/>
+          <w:color w:val="000000"/>
+          <w:sz w:val="20"/>
+        </w:rPr>
+      </w:pPr>
+      <w:r>
+        <w:rPr>
+          <w:color w:val="000000"/>
+          <w:sz w:val="20"/>
+        </w:rPr>
+        <w:br/>
+        <w:t>It is necessary to present a conceptual model that shows the novelty of the work, such as the degradation of macroalgae with existing models and with the modification of the model you are presenting.</w:t>
+      </w:r>
+      <w:r>
+        <w:rPr>
+          <w:color w:val="000000"/>
+          <w:sz w:val="20"/>
+        </w:rPr>
+        <w:br/>
+      </w:r>
+      <w:r>
+        <w:rPr>
+          <w:color w:val="000000"/>
+          <w:sz w:val="20"/>
+        </w:rPr>
+        <w:br/>
+      </w:r>
+      <w:r>
+        <w:rPr>
+          <w:i/>
+          <w:iCs/>
+          <w:color w:val="000000"/>
+          <w:sz w:val="20"/>
+        </w:rPr>
+        <w:t xml:space="preserve">This was also </w:t>
+      </w:r>
+      <w:r>
+        <w:rPr>
+          <w:i/>
+          <w:iCs/>
+          <w:color w:val="000000"/>
+          <w:sz w:val="20"/>
+        </w:rPr>
+        <w:t xml:space="preserve">requested by Reviewer #3. I have </w:t>
+      </w:r>
+      <w:r>
+        <w:rPr>
+          <w:i/>
+          <w:iCs/>
+          <w:color w:val="000000"/>
+          <w:sz w:val="20"/>
+        </w:rPr>
+        <w:t>fit the conventional model (e</w:t>
+      </w:r>
+      <w:r>
+        <w:rPr>
+          <w:i/>
+          <w:iCs/>
+          <w:color w:val="000000"/>
+          <w:sz w:val="20"/>
+          <w:vertAlign w:val="superscript"/>
+        </w:rPr>
+        <w:t>−kt</w:t>
+      </w:r>
+      <w:r>
+        <w:rPr>
+          <w:i/>
+          <w:iCs/>
+          <w:color w:val="000000"/>
+          <w:sz w:val="20"/>
+        </w:rPr>
+        <w:t xml:space="preserve">) to each example dataset to show that it </w:t>
+      </w:r>
+      <w:r>
+        <w:rPr>
+          <w:i/>
+          <w:iCs/>
+          <w:color w:val="000000"/>
+          <w:sz w:val="20"/>
+        </w:rPr>
+        <w:t>is ill-fitting</w:t>
+      </w:r>
+      <w:r>
+        <w:rPr>
+          <w:i/>
+          <w:iCs/>
+          <w:color w:val="000000"/>
+          <w:sz w:val="20"/>
+        </w:rPr>
+        <w:t xml:space="preserve"> in most cases (</w:t>
+      </w:r>
+      <w:r>
+        <w:rPr>
+          <w:i/>
+          <w:iCs/>
+          <w:color w:val="000000"/>
+          <w:sz w:val="20"/>
+        </w:rPr>
+        <w:t>cf.</w:t>
+      </w:r>
+      <w:r>
+        <w:rPr>
+          <w:i/>
+          <w:iCs/>
+          <w:color w:val="000000"/>
+          <w:sz w:val="20"/>
+        </w:rPr>
+        <w:t xml:space="preserve"> </w:t>
+      </w:r>
+      <w:r>
+        <w:rPr>
+          <w:i/>
+          <w:iCs/>
+          <w:color w:val="000000"/>
+          <w:sz w:val="20"/>
+        </w:rPr>
+        <w:t>Figures 2–6 with S2–S6</w:t>
+      </w:r>
+      <w:r>
+        <w:rPr>
+          <w:i/>
+          <w:iCs/>
+          <w:color w:val="000000"/>
+          <w:sz w:val="20"/>
+        </w:rPr>
+        <w:t>) and formally compare k</w:t>
+      </w:r>
+      <w:r>
+        <w:rPr>
+          <w:i/>
+          <w:iCs/>
+          <w:color w:val="000000"/>
+          <w:sz w:val="20"/>
+        </w:rPr>
+        <w:t xml:space="preserve"> and</w:t>
+      </w:r>
+      <w:r>
+        <w:t xml:space="preserve"> </w:t>
+      </w:r>
+      <w:r>
+        <w:rPr>
+          <w:i/>
+          <w:iCs/>
+          <w:color w:val="000000"/>
+          <w:sz w:val="20"/>
+        </w:rPr>
+        <w:t>τ</w:t>
+      </w:r>
+      <w:r>
+        <w:rPr>
+          <w:i/>
+          <w:iCs/>
+          <w:color w:val="000000"/>
+          <w:sz w:val="20"/>
+        </w:rPr>
+        <w:t xml:space="preserve"> as well as t</w:t>
+      </w:r>
+      <w:r>
+        <w:rPr>
+          <w:i/>
+          <w:iCs/>
+          <w:color w:val="000000"/>
+          <w:sz w:val="20"/>
+          <w:vertAlign w:val="subscript"/>
+        </w:rPr>
+        <w:t xml:space="preserve">½ </w:t>
+      </w:r>
+      <w:r>
+        <w:rPr>
+          <w:i/>
+          <w:iCs/>
+          <w:color w:val="000000"/>
+          <w:sz w:val="20"/>
+        </w:rPr>
+        <w:t>and</w:t>
+      </w:r>
+      <w:r>
+        <w:t xml:space="preserve"> </w:t>
+      </w:r>
+      <w:r>
+        <w:rPr>
+          <w:i/>
+          <w:iCs/>
+          <w:color w:val="000000"/>
+          <w:sz w:val="20"/>
+        </w:rPr>
+        <w:t>μ</w:t>
+      </w:r>
+      <w:r>
+        <w:rPr>
+          <w:i/>
+          <w:iCs/>
+          <w:color w:val="000000"/>
+          <w:sz w:val="20"/>
+        </w:rPr>
+        <w:t xml:space="preserve"> (Table 1, 2)</w:t>
+      </w:r>
+      <w:r>
+        <w:rPr>
+          <w:i/>
+          <w:iCs/>
+          <w:color w:val="000000"/>
+          <w:sz w:val="20"/>
+        </w:rPr>
+        <w:t>.</w:t>
+      </w:r>
+    </w:p>
+    <w:p>
+      <w:pPr>
+        <w:jc w:val="left"/>
+        <w:rPr>
+          <w:color w:val="000000"/>
+          <w:sz w:val="20"/>
+        </w:rPr>
+      </w:pPr>
+      <w:r>
+        <w:rPr>
+          <w:color w:val="000000"/>
+          <w:sz w:val="20"/>
+        </w:rPr>
+        <w:br/>
+      </w:r>
+      <w:r>
+        <w:rPr>
+          <w:b/>
+          <w:bCs/>
+          <w:color w:val="000000"/>
+          <w:sz w:val="20"/>
+        </w:rPr>
+        <w:t>Reviewer #3</w:t>
+      </w:r>
+      <w:r>
+        <w:rPr>
+          <w:color w:val="000000"/>
+          <w:sz w:val="20"/>
+        </w:rPr>
+        <w:t xml:space="preserve">: </w:t>
+      </w:r>
+    </w:p>
+    <w:p>
+      <w:pPr>
+        <w:jc w:val="left"/>
+        <w:rPr>
+          <w:color w:val="000000"/>
+          <w:sz w:val="20"/>
+        </w:rPr>
+      </w:pPr>
+      <w:r>
+        <w:rPr>
+          <w:color w:val="000000"/>
+          <w:sz w:val="20"/>
+        </w:rPr>
+        <w:t>You present a decomposition model that explicitly accommodates early increases or plateaus in normalised detrital mass m(t) by modelling a time</w:t>
+      </w:r>
+      <w:r>
+        <w:rPr>
+          <w:color w:val="000000"/>
+          <w:sz w:val="20"/>
+        </w:rPr>
+        <w:noBreakHyphen/>
+        <w:t>varying rate k(t) that transitions logistically towards a final rate τ. You fit the model in a Bayesian framework, using a beta prime observation model for ratios m &gt; 0 (allowing m &gt; 1) and a time</w:t>
+      </w:r>
+      <w:r>
+        <w:rPr>
+          <w:color w:val="000000"/>
+          <w:sz w:val="20"/>
+        </w:rPr>
+        <w:noBreakHyphen/>
+        <w:t>varying precision ν(t). A range of example datasets is used to demonstrate flexibility and interpretability. The paper is clearly structured, and the illustrative examples and figures are effective in communicating the behaviour of the model and its parameters. The contribution is promising; the main issues below concern (</w:t>
+      </w:r>
+      <w:proofErr w:type="spellStart"/>
+      <w:r>
+        <w:rPr>
+          <w:color w:val="000000"/>
+          <w:sz w:val="20"/>
+        </w:rPr>
+        <w:t>i</w:t>
+      </w:r>
+      <w:proofErr w:type="spellEnd"/>
+      <w:r>
+        <w:rPr>
+          <w:color w:val="000000"/>
+          <w:sz w:val="20"/>
+        </w:rPr>
+        <w:t>) parameter identifiability and ecological interpretation, (ii) validation of the observation model and heteroscedastic structure, and (iii) formal comparison with standard approaches to support synthesis</w:t>
+      </w:r>
+      <w:r>
+        <w:rPr>
+          <w:color w:val="000000"/>
+          <w:sz w:val="20"/>
+        </w:rPr>
+        <w:noBreakHyphen/>
+        <w:t>oriented claims.</w:t>
+      </w:r>
+    </w:p>
+    <w:p>
+      <w:pPr>
+        <w:jc w:val="left"/>
+        <w:rPr>
+          <w:color w:val="000000"/>
+          <w:sz w:val="20"/>
+        </w:rPr>
+      </w:pPr>
+    </w:p>
+    <w:p>
+      <w:pPr>
+        <w:jc w:val="left"/>
+        <w:rPr>
+          <w:i/>
+          <w:iCs/>
+          <w:color w:val="000000"/>
+          <w:sz w:val="20"/>
+        </w:rPr>
+      </w:pPr>
+      <w:r>
+        <w:rPr>
+          <w:i/>
+          <w:iCs/>
+          <w:color w:val="000000"/>
+          <w:sz w:val="20"/>
+        </w:rPr>
+        <w:t>This is the most competent review I have ever received. Thank you.</w:t>
+      </w:r>
+      <w:r>
+        <w:rPr>
+          <w:i/>
+          <w:iCs/>
+          <w:color w:val="000000"/>
+          <w:sz w:val="20"/>
+        </w:rPr>
+        <w:t xml:space="preserve"> I encourage you to get in touch for further discussions.</w:t>
+      </w:r>
+    </w:p>
+    <w:p>
+      <w:pPr>
+        <w:jc w:val="left"/>
+        <w:rPr>
+          <w:color w:val="000000"/>
+          <w:sz w:val="20"/>
+        </w:rPr>
+      </w:pPr>
+      <w:r>
+        <w:rPr>
+          <w:color w:val="000000"/>
+          <w:sz w:val="20"/>
+        </w:rPr>
+        <w:br/>
+        <w:t>Highlights</w:t>
+      </w:r>
+      <w:r>
+        <w:rPr>
+          <w:color w:val="000000"/>
+          <w:sz w:val="20"/>
+        </w:rPr>
+        <w:br/>
+        <w:t xml:space="preserve">The submitted highlights are generally relevant, but I recommend revising them to avoid absolute or difficult-to-substantiate claims. In particular, "First mathematical model of macroalgal decomposition" is hard to verify, and "Can describe any macroalgal decomposition trajectory" is too absolute. Likewise, "Enables meta-analysis…" would read more cautiously as "supports/facilitates meta-analysis", unless a formal demonstration is provided in the </w:t>
+      </w:r>
+      <w:r>
+        <w:rPr>
+          <w:color w:val="000000"/>
+          <w:sz w:val="20"/>
+        </w:rPr>
+        <w:lastRenderedPageBreak/>
+        <w:t>manuscript. I suggest rephrasing the highlights to emphasise verifiable contributions (e.g., a parsimonious time-varying k(t)k(t)k(t), use of a beta prime likelihood for positive mass ratios including values &gt;1, and estimation of a terminal decay parameter τ\</w:t>
+      </w:r>
+      <w:proofErr w:type="spellStart"/>
+      <w:r>
+        <w:rPr>
+          <w:color w:val="000000"/>
+          <w:sz w:val="20"/>
+        </w:rPr>
+        <w:t>tauτ</w:t>
+      </w:r>
+      <w:proofErr w:type="spellEnd"/>
+      <w:r>
+        <w:rPr>
+          <w:color w:val="000000"/>
+          <w:sz w:val="20"/>
+        </w:rPr>
+        <w:t xml:space="preserve"> intended to be comparable with the classical exponential </w:t>
+      </w:r>
+      <w:proofErr w:type="spellStart"/>
+      <w:r>
+        <w:rPr>
+          <w:color w:val="000000"/>
+          <w:sz w:val="20"/>
+        </w:rPr>
+        <w:t>kkk</w:t>
+      </w:r>
+      <w:proofErr w:type="spellEnd"/>
+      <w:r>
+        <w:rPr>
+          <w:color w:val="000000"/>
+          <w:sz w:val="20"/>
+        </w:rPr>
+        <w:t>).</w:t>
+      </w:r>
+      <w:r>
+        <w:rPr>
+          <w:color w:val="000000"/>
+          <w:sz w:val="20"/>
+        </w:rPr>
+        <w:br/>
+      </w:r>
+    </w:p>
+    <w:p>
+      <w:pPr>
+        <w:jc w:val="left"/>
+        <w:rPr>
+          <w:i/>
+          <w:iCs/>
+          <w:color w:val="000000"/>
+          <w:sz w:val="20"/>
+        </w:rPr>
+      </w:pPr>
+      <w:r>
+        <w:rPr>
+          <w:i/>
+          <w:iCs/>
+          <w:color w:val="000000"/>
+          <w:sz w:val="20"/>
+        </w:rPr>
+        <w:t>This was also requested by Reviewer #2.</w:t>
+      </w:r>
+      <w:r>
+        <w:rPr>
+          <w:i/>
+          <w:iCs/>
+          <w:color w:val="000000"/>
+          <w:sz w:val="20"/>
+        </w:rPr>
+        <w:t xml:space="preserve"> </w:t>
+      </w:r>
+      <w:r>
+        <w:rPr>
+          <w:i/>
+          <w:iCs/>
+          <w:color w:val="000000"/>
+          <w:sz w:val="20"/>
+        </w:rPr>
+        <w:t xml:space="preserve">I have </w:t>
+      </w:r>
+      <w:r>
+        <w:rPr>
+          <w:i/>
+          <w:iCs/>
+          <w:color w:val="000000"/>
+          <w:sz w:val="20"/>
+        </w:rPr>
+        <w:t>rewritten the highlights accordingly.</w:t>
+      </w:r>
+    </w:p>
+    <w:p>
+      <w:pPr>
+        <w:jc w:val="left"/>
+        <w:rPr>
+          <w:color w:val="000000"/>
+          <w:sz w:val="20"/>
+        </w:rPr>
+      </w:pPr>
+    </w:p>
+    <w:p>
+      <w:pPr>
+        <w:jc w:val="left"/>
+        <w:rPr>
+          <w:color w:val="000000"/>
+          <w:sz w:val="20"/>
+        </w:rPr>
+      </w:pPr>
+      <w:r>
+        <w:rPr>
+          <w:color w:val="000000"/>
+          <w:sz w:val="20"/>
+        </w:rPr>
+        <w:t>Major comments</w:t>
+      </w:r>
+      <w:r>
+        <w:rPr>
+          <w:color w:val="000000"/>
+          <w:sz w:val="20"/>
+        </w:rPr>
+        <w:br/>
+        <w:t>1. Identifiability and interpretation of μ (transition time / photosynthetic 'death')</w:t>
+      </w:r>
+      <w:r>
+        <w:rPr>
+          <w:color w:val="000000"/>
+          <w:sz w:val="20"/>
+        </w:rPr>
+        <w:br/>
+        <w:t xml:space="preserve">μ governs the timing of the logistic transition in k(t) and is interpreted as the time at which detrital photosynthesis ceases to matter. In at least one key example, μ appears to be weakly informed by the observation window. In the </w:t>
+      </w:r>
+      <w:proofErr w:type="spellStart"/>
+      <w:r>
+        <w:rPr>
+          <w:color w:val="000000"/>
+          <w:sz w:val="20"/>
+        </w:rPr>
+        <w:t>Desmarestia</w:t>
+      </w:r>
+      <w:proofErr w:type="spellEnd"/>
+      <w:r>
+        <w:rPr>
+          <w:color w:val="000000"/>
+          <w:sz w:val="20"/>
+        </w:rPr>
+        <w:t xml:space="preserve"> anceps example, the manuscript reports μ on the order of many hundreds of days, whilst the time axis shown in the corresponding figure spans a substantially shorter period. Importantly, the manuscript notes that the experimental duration is not long enough to inform τ for the control treatment, which strengthens the concern that μ may also be poorly identified when the transition sits outside the observed window.</w:t>
+      </w:r>
+      <w:r>
+        <w:rPr>
+          <w:color w:val="000000"/>
+          <w:sz w:val="20"/>
+        </w:rPr>
+        <w:t xml:space="preserve"> </w:t>
+      </w:r>
+      <w:r>
+        <w:rPr>
+          <w:color w:val="000000"/>
+          <w:sz w:val="20"/>
+        </w:rPr>
+        <w:t>Please add (</w:t>
+      </w:r>
+      <w:proofErr w:type="spellStart"/>
+      <w:r>
+        <w:rPr>
+          <w:color w:val="000000"/>
+          <w:sz w:val="20"/>
+        </w:rPr>
+        <w:t>i</w:t>
+      </w:r>
+      <w:proofErr w:type="spellEnd"/>
+      <w:r>
+        <w:rPr>
+          <w:color w:val="000000"/>
+          <w:sz w:val="20"/>
+        </w:rPr>
+        <w:t>) explicit identifiability diagnostics (pair plots/correlations for μ-τ and μ-α, trace plots, ESS/</w:t>
+      </w:r>
+      <w:proofErr w:type="spellStart"/>
+      <w:r>
+        <w:rPr>
+          <w:color w:val="000000"/>
+          <w:sz w:val="20"/>
+        </w:rPr>
+        <w:t>Rhat</w:t>
+      </w:r>
+      <w:proofErr w:type="spellEnd"/>
+      <w:r>
+        <w:rPr>
+          <w:color w:val="000000"/>
+          <w:sz w:val="20"/>
+        </w:rPr>
+        <w:t>), and (ii) a brief sensitivity analysis for the prior on μ (at least two reasonable priors), reporting impact on τ and on predictive trajectories. Where μ clearly exceeds the experimental duration, please clarify how it should be interpreted ecologically (e.g., 'transition not observed / not estimable within study duration') to avoid over</w:t>
+      </w:r>
+      <w:r>
+        <w:rPr>
+          <w:color w:val="000000"/>
+          <w:sz w:val="20"/>
+        </w:rPr>
+        <w:noBreakHyphen/>
+        <w:t>interpretation.</w:t>
+      </w:r>
+    </w:p>
+    <w:p>
+      <w:pPr>
+        <w:jc w:val="left"/>
+        <w:rPr>
+          <w:color w:val="000000"/>
+          <w:sz w:val="20"/>
+        </w:rPr>
+      </w:pPr>
+    </w:p>
+    <w:p>
+      <w:pPr>
+        <w:jc w:val="left"/>
+        <w:rPr>
+          <w:i/>
+          <w:iCs/>
+          <w:color w:val="000000"/>
+          <w:sz w:val="20"/>
+          <w:u w:val="single"/>
+        </w:rPr>
+      </w:pPr>
+      <w:r>
+        <w:rPr>
+          <w:i/>
+          <w:iCs/>
+          <w:color w:val="000000"/>
+          <w:sz w:val="20"/>
+          <w:u w:val="single"/>
+        </w:rPr>
+        <w:t>Identifiability</w:t>
+      </w:r>
+    </w:p>
+    <w:p>
+      <w:pPr>
+        <w:jc w:val="left"/>
+        <w:rPr>
+          <w:i/>
+          <w:iCs/>
+          <w:color w:val="000000"/>
+          <w:sz w:val="20"/>
+        </w:rPr>
+      </w:pPr>
+      <w:r>
+        <w:rPr>
+          <w:i/>
+          <w:iCs/>
+          <w:color w:val="000000"/>
+          <w:sz w:val="20"/>
+        </w:rPr>
+        <w:t xml:space="preserve">Correct, µ is not identifiable if the experimental duration is of insufficient length. </w:t>
+      </w:r>
+      <w:r>
+        <w:rPr>
+          <w:i/>
+          <w:iCs/>
+          <w:color w:val="000000"/>
+          <w:sz w:val="20"/>
+        </w:rPr>
+        <w:t>P</w:t>
+      </w:r>
+      <w:r>
+        <w:rPr>
+          <w:i/>
+          <w:iCs/>
+          <w:color w:val="000000"/>
+          <w:sz w:val="20"/>
+        </w:rPr>
+        <w:t>air plots</w:t>
+      </w:r>
+      <w:r>
+        <w:rPr>
+          <w:i/>
+          <w:iCs/>
+          <w:color w:val="000000"/>
+          <w:sz w:val="20"/>
+        </w:rPr>
+        <w:t xml:space="preserve">, </w:t>
+      </w:r>
+      <w:r>
+        <w:rPr>
+          <w:i/>
+          <w:iCs/>
+          <w:color w:val="000000"/>
+          <w:sz w:val="20"/>
+        </w:rPr>
+        <w:t xml:space="preserve">trace rank plots </w:t>
+      </w:r>
+      <w:r>
+        <w:rPr>
+          <w:i/>
+          <w:iCs/>
+          <w:color w:val="000000"/>
+          <w:sz w:val="20"/>
+        </w:rPr>
+        <w:t xml:space="preserve">and prior-posterior plots for all examples </w:t>
+      </w:r>
+      <w:r>
+        <w:rPr>
+          <w:i/>
+          <w:iCs/>
+          <w:color w:val="000000"/>
+          <w:sz w:val="20"/>
+        </w:rPr>
+        <w:t>are now</w:t>
+      </w:r>
+      <w:r>
+        <w:rPr>
+          <w:i/>
+          <w:iCs/>
+          <w:color w:val="000000"/>
+          <w:sz w:val="20"/>
+        </w:rPr>
+        <w:t xml:space="preserve"> available</w:t>
+      </w:r>
+      <w:r>
+        <w:rPr>
+          <w:i/>
+          <w:iCs/>
+          <w:color w:val="000000"/>
+          <w:sz w:val="20"/>
+        </w:rPr>
+        <w:t xml:space="preserve"> </w:t>
+      </w:r>
+      <w:r>
+        <w:rPr>
+          <w:i/>
+          <w:iCs/>
+          <w:color w:val="000000"/>
+          <w:sz w:val="20"/>
+        </w:rPr>
+        <w:t>in the repository</w:t>
+      </w:r>
+      <w:r>
+        <w:rPr>
+          <w:i/>
+          <w:iCs/>
+          <w:color w:val="000000"/>
+          <w:sz w:val="20"/>
+        </w:rPr>
+        <w:t xml:space="preserve"> (</w:t>
+      </w:r>
+      <w:hyperlink r:id="rId13" w:history="1">
+        <w:r>
+          <w:rPr>
+            <w:rStyle w:val="Hyperlink"/>
+            <w:i/>
+            <w:iCs/>
+            <w:sz w:val="20"/>
+          </w:rPr>
+          <w:t>github.com/</w:t>
+        </w:r>
+        <w:proofErr w:type="spellStart"/>
+        <w:r>
+          <w:rPr>
+            <w:rStyle w:val="Hyperlink"/>
+            <w:i/>
+            <w:iCs/>
+            <w:sz w:val="20"/>
+          </w:rPr>
+          <w:t>lukaseamus</w:t>
+        </w:r>
+        <w:proofErr w:type="spellEnd"/>
+        <w:r>
+          <w:rPr>
+            <w:rStyle w:val="Hyperlink"/>
+            <w:i/>
+            <w:iCs/>
+            <w:sz w:val="20"/>
+          </w:rPr>
+          <w:t>/</w:t>
+        </w:r>
+        <w:proofErr w:type="spellStart"/>
+        <w:r>
+          <w:rPr>
+            <w:rStyle w:val="Hyperlink"/>
+            <w:i/>
+            <w:iCs/>
+            <w:sz w:val="20"/>
+          </w:rPr>
+          <w:t>limbodeco</w:t>
+        </w:r>
+        <w:proofErr w:type="spellEnd"/>
+        <w:r>
+          <w:rPr>
+            <w:rStyle w:val="Hyperlink"/>
+            <w:i/>
+            <w:iCs/>
+            <w:sz w:val="20"/>
+          </w:rPr>
+          <w:t>/tree/main/Plots</w:t>
         </w:r>
       </w:hyperlink>
       <w:r>
         <w:rPr>
-          <w:sz w:val="20"/>
-        </w:rPr>
-        <w:t xml:space="preserve"> </w:t>
-      </w:r>
-      <w:r>
-        <w:rPr>
-          <w:sz w:val="20"/>
-        </w:rPr>
-        <w:t>and I encourage you to pass these on to the reviewers.</w:t>
+          <w:i/>
+          <w:iCs/>
+          <w:color w:val="000000"/>
+          <w:sz w:val="20"/>
+        </w:rPr>
+        <w:t xml:space="preserve">) Diagnostic </w:t>
+      </w:r>
+      <w:r>
+        <w:rPr>
+          <w:i/>
+          <w:iCs/>
+          <w:color w:val="000000"/>
+          <w:sz w:val="20"/>
+        </w:rPr>
+        <w:t xml:space="preserve">plots are too numerous and large for </w:t>
+      </w:r>
+      <w:r>
+        <w:rPr>
+          <w:i/>
+          <w:iCs/>
+          <w:color w:val="000000"/>
+          <w:sz w:val="20"/>
+        </w:rPr>
+        <w:t xml:space="preserve">inclusion </w:t>
+      </w:r>
+      <w:r>
+        <w:rPr>
+          <w:i/>
+          <w:iCs/>
+          <w:color w:val="000000"/>
+          <w:sz w:val="20"/>
+        </w:rPr>
+        <w:t>as s</w:t>
+      </w:r>
+      <w:r>
+        <w:rPr>
+          <w:i/>
+          <w:iCs/>
+          <w:color w:val="000000"/>
+          <w:sz w:val="20"/>
+        </w:rPr>
+        <w:t>upplement</w:t>
+      </w:r>
+      <w:r>
+        <w:rPr>
+          <w:i/>
+          <w:iCs/>
+          <w:color w:val="000000"/>
+          <w:sz w:val="20"/>
+        </w:rPr>
+        <w:t>ary figures</w:t>
+      </w:r>
+      <w:r>
+        <w:rPr>
+          <w:i/>
+          <w:iCs/>
+          <w:color w:val="000000"/>
+          <w:sz w:val="20"/>
+        </w:rPr>
+        <w:t>,</w:t>
+      </w:r>
+      <w:r>
+        <w:rPr>
+          <w:i/>
+          <w:iCs/>
+          <w:color w:val="000000"/>
+          <w:sz w:val="20"/>
+        </w:rPr>
+        <w:t xml:space="preserve"> but I explicitly refer the reader to</w:t>
+      </w:r>
+      <w:r>
+        <w:rPr>
+          <w:i/>
+          <w:iCs/>
+          <w:color w:val="000000"/>
+          <w:sz w:val="20"/>
+        </w:rPr>
+        <w:t xml:space="preserve"> the repository</w:t>
+      </w:r>
+      <w:r>
+        <w:rPr>
+          <w:i/>
+          <w:iCs/>
+          <w:color w:val="000000"/>
+          <w:sz w:val="20"/>
+        </w:rPr>
+        <w:t xml:space="preserve"> folder</w:t>
+      </w:r>
+      <w:r>
+        <w:rPr>
+          <w:i/>
+          <w:iCs/>
+          <w:color w:val="000000"/>
+          <w:sz w:val="20"/>
+        </w:rPr>
+        <w:t>.</w:t>
       </w:r>
     </w:p>
     <w:p>
       <w:pPr>
         <w:jc w:val="left"/>
         <w:rPr>
+          <w:i/>
+          <w:iCs/>
           <w:color w:val="000000"/>
           <w:sz w:val="20"/>
         </w:rPr>
@@ -458,55 +1590,22 @@
       <w:pPr>
         <w:jc w:val="left"/>
         <w:rPr>
-          <w:color w:val="000000"/>
-          <w:sz w:val="20"/>
-        </w:rPr>
-      </w:pPr>
-      <w:r>
-        <w:rPr>
-          <w:b/>
-          <w:bCs/>
-          <w:color w:val="000000"/>
-          <w:sz w:val="20"/>
-        </w:rPr>
-        <w:t>Reviewer #2</w:t>
-      </w:r>
-      <w:r>
-        <w:rPr>
-          <w:color w:val="000000"/>
-          <w:sz w:val="20"/>
-        </w:rPr>
-        <w:t>:</w:t>
-      </w:r>
-      <w:r>
-        <w:rPr>
-          <w:color w:val="000000"/>
-          <w:sz w:val="20"/>
-        </w:rPr>
-        <w:br/>
-        <w:t>I think the paper is very well written, detailed, and well explained. The development of the equations is well structured. I think the manuscript is ideal for publication in the journal. I have minor comment:</w:t>
-      </w:r>
-      <w:r>
-        <w:rPr>
-          <w:color w:val="000000"/>
-          <w:sz w:val="20"/>
-        </w:rPr>
-        <w:br/>
-      </w:r>
-      <w:r>
-        <w:rPr>
-          <w:color w:val="000000"/>
-          <w:sz w:val="20"/>
-        </w:rPr>
-        <w:br/>
-        <w:t>Line 9: Are you sure this is the world's first mathematical model for macroalgal decomposition?</w:t>
-      </w:r>
-      <w:r>
-        <w:rPr>
-          <w:color w:val="000000"/>
-          <w:sz w:val="20"/>
-        </w:rPr>
-        <w:br/>
+          <w:i/>
+          <w:iCs/>
+          <w:color w:val="000000"/>
+          <w:sz w:val="20"/>
+          <w:u w:val="single"/>
+        </w:rPr>
+      </w:pPr>
+      <w:r>
+        <w:rPr>
+          <w:i/>
+          <w:iCs/>
+          <w:color w:val="000000"/>
+          <w:sz w:val="20"/>
+          <w:u w:val="single"/>
+        </w:rPr>
+        <w:t>Interpretability</w:t>
       </w:r>
     </w:p>
     <w:p>
@@ -526,586 +1625,6 @@
           <w:color w:val="000000"/>
           <w:sz w:val="20"/>
         </w:rPr>
-        <w:t xml:space="preserve">Thank you. </w:t>
-      </w:r>
-      <w:r>
-        <w:rPr>
-          <w:i/>
-          <w:iCs/>
-          <w:color w:val="000000"/>
-          <w:sz w:val="20"/>
-        </w:rPr>
-        <w:t xml:space="preserve">This was also </w:t>
-      </w:r>
-      <w:r>
-        <w:rPr>
-          <w:i/>
-          <w:iCs/>
-          <w:color w:val="000000"/>
-          <w:sz w:val="20"/>
-        </w:rPr>
-        <w:t>noted by Reviewer #3. I have removed this statement.</w:t>
-      </w:r>
-    </w:p>
-    <w:p>
-      <w:pPr>
-        <w:jc w:val="left"/>
-        <w:rPr>
-          <w:i/>
-          <w:iCs/>
-          <w:color w:val="000000"/>
-          <w:sz w:val="20"/>
-        </w:rPr>
-      </w:pPr>
-      <w:r>
-        <w:rPr>
-          <w:color w:val="000000"/>
-          <w:sz w:val="20"/>
-        </w:rPr>
-        <w:br/>
-        <w:t>It is necessary to present a conceptual model that shows the novelty of the work, such as the degradation of macroalgae with existing models and with the modification of the model you are presenting.</w:t>
-      </w:r>
-      <w:r>
-        <w:rPr>
-          <w:color w:val="000000"/>
-          <w:sz w:val="20"/>
-        </w:rPr>
-        <w:br/>
-      </w:r>
-      <w:r>
-        <w:rPr>
-          <w:color w:val="000000"/>
-          <w:sz w:val="20"/>
-        </w:rPr>
-        <w:br/>
-      </w:r>
-      <w:r>
-        <w:rPr>
-          <w:i/>
-          <w:iCs/>
-          <w:color w:val="000000"/>
-          <w:sz w:val="20"/>
-        </w:rPr>
-        <w:t xml:space="preserve">This was also </w:t>
-      </w:r>
-      <w:r>
-        <w:rPr>
-          <w:i/>
-          <w:iCs/>
-          <w:color w:val="000000"/>
-          <w:sz w:val="20"/>
-        </w:rPr>
-        <w:t xml:space="preserve">requested by Reviewer #3. I have </w:t>
-      </w:r>
-      <w:r>
-        <w:rPr>
-          <w:i/>
-          <w:iCs/>
-          <w:color w:val="000000"/>
-          <w:sz w:val="20"/>
-        </w:rPr>
-        <w:t>fit the conventional model (e</w:t>
-      </w:r>
-      <w:r>
-        <w:rPr>
-          <w:i/>
-          <w:iCs/>
-          <w:color w:val="000000"/>
-          <w:sz w:val="20"/>
-          <w:vertAlign w:val="superscript"/>
-        </w:rPr>
-        <w:t>−kt</w:t>
-      </w:r>
-      <w:r>
-        <w:rPr>
-          <w:i/>
-          <w:iCs/>
-          <w:color w:val="000000"/>
-          <w:sz w:val="20"/>
-        </w:rPr>
-        <w:t>) to each example dataset to show that it doesn’t predict data well in most cases (see supplementary figures) and formally compare k with the new parameters.</w:t>
-      </w:r>
-    </w:p>
-    <w:p>
-      <w:pPr>
-        <w:jc w:val="left"/>
-        <w:rPr>
-          <w:color w:val="000000"/>
-          <w:sz w:val="20"/>
-        </w:rPr>
-      </w:pPr>
-      <w:r>
-        <w:rPr>
-          <w:color w:val="000000"/>
-          <w:sz w:val="20"/>
-        </w:rPr>
-        <w:br/>
-      </w:r>
-      <w:r>
-        <w:rPr>
-          <w:b/>
-          <w:bCs/>
-          <w:color w:val="000000"/>
-          <w:sz w:val="20"/>
-        </w:rPr>
-        <w:t>Reviewer #3</w:t>
-      </w:r>
-      <w:r>
-        <w:rPr>
-          <w:color w:val="000000"/>
-          <w:sz w:val="20"/>
-        </w:rPr>
-        <w:t xml:space="preserve">: </w:t>
-      </w:r>
-    </w:p>
-    <w:p>
-      <w:pPr>
-        <w:jc w:val="left"/>
-        <w:rPr>
-          <w:color w:val="000000"/>
-          <w:sz w:val="20"/>
-        </w:rPr>
-      </w:pPr>
-      <w:r>
-        <w:rPr>
-          <w:color w:val="000000"/>
-          <w:sz w:val="20"/>
-        </w:rPr>
-        <w:t>You present a decomposition model that explicitly accommodates early increases or plateaus in normalised detrital mass m(t) by modelling a time</w:t>
-      </w:r>
-      <w:r>
-        <w:rPr>
-          <w:color w:val="000000"/>
-          <w:sz w:val="20"/>
-        </w:rPr>
-        <w:noBreakHyphen/>
-        <w:t>varying rate k(t) that transitions logistically towards a final rate τ. You fit the model in a Bayesian framework, using a beta prime observation model for ratios m &gt; 0 (allowing m &gt; 1) and a time</w:t>
-      </w:r>
-      <w:r>
-        <w:rPr>
-          <w:color w:val="000000"/>
-          <w:sz w:val="20"/>
-        </w:rPr>
-        <w:noBreakHyphen/>
-        <w:t>varying precision ν(t). A range of example datasets is used to demonstrate flexibility and interpretability. The paper is clearly structured, and the illustrative examples and figures are effective in communicating the behaviour of the model and its parameters. The contribution is promising; the main issues below concern (i) parameter identifiability and ecological interpretation, (ii) validation of the observation model and heteroscedastic structure, and (iii) formal comparison with standard approaches to support synthesis</w:t>
-      </w:r>
-      <w:r>
-        <w:rPr>
-          <w:color w:val="000000"/>
-          <w:sz w:val="20"/>
-        </w:rPr>
-        <w:noBreakHyphen/>
-        <w:t>oriented claims.</w:t>
-      </w:r>
-    </w:p>
-    <w:p>
-      <w:pPr>
-        <w:jc w:val="left"/>
-        <w:rPr>
-          <w:color w:val="000000"/>
-          <w:sz w:val="20"/>
-        </w:rPr>
-      </w:pPr>
-    </w:p>
-    <w:p>
-      <w:pPr>
-        <w:jc w:val="left"/>
-        <w:rPr>
-          <w:i/>
-          <w:iCs/>
-          <w:color w:val="000000"/>
-          <w:sz w:val="20"/>
-        </w:rPr>
-      </w:pPr>
-      <w:r>
-        <w:rPr>
-          <w:i/>
-          <w:iCs/>
-          <w:color w:val="000000"/>
-          <w:sz w:val="20"/>
-        </w:rPr>
-        <w:t>This is the most competent review I have ever received. Thank you.</w:t>
-      </w:r>
-    </w:p>
-    <w:p>
-      <w:pPr>
-        <w:jc w:val="left"/>
-        <w:rPr>
-          <w:color w:val="000000"/>
-          <w:sz w:val="20"/>
-        </w:rPr>
-      </w:pPr>
-      <w:r>
-        <w:rPr>
-          <w:color w:val="000000"/>
-          <w:sz w:val="20"/>
-        </w:rPr>
-        <w:br/>
-        <w:t>Highlights</w:t>
-      </w:r>
-      <w:r>
-        <w:rPr>
-          <w:color w:val="000000"/>
-          <w:sz w:val="20"/>
-        </w:rPr>
-        <w:br/>
-        <w:t>The submitted highlights are generally relevant, but I recommend revising them to avoid absolute or difficult-to-substantiate claims. In particular, "First mathematical model of macroalgal decomposition" is hard to verify, and "Can describe any macroalgal decomposition trajectory" is too absolute. Likewise, "Enables meta-analysis…" would read more cautiously as "supports/facilitates meta-analysis", unless a formal demonstration is provided in the manuscript. I suggest rephrasing the highlights to emphasise verifiable contributions (e.g., a parsimonious time-varying k(t)k(t)k(t), use of a beta prime likelihood for positive mass ratios including values &gt;1, and estimation of a terminal decay parameter τ\tauτ intended to be comparable with the classical exponential kkk).</w:t>
-      </w:r>
-      <w:r>
-        <w:rPr>
-          <w:color w:val="000000"/>
-          <w:sz w:val="20"/>
-        </w:rPr>
-        <w:br/>
-      </w:r>
-    </w:p>
-    <w:p>
-      <w:pPr>
-        <w:jc w:val="left"/>
-        <w:rPr>
-          <w:i/>
-          <w:iCs/>
-          <w:color w:val="000000"/>
-          <w:sz w:val="20"/>
-        </w:rPr>
-      </w:pPr>
-      <w:r>
-        <w:rPr>
-          <w:i/>
-          <w:iCs/>
-          <w:color w:val="000000"/>
-          <w:sz w:val="20"/>
-        </w:rPr>
-        <w:t>This was also requested by Reviewer #2.</w:t>
-      </w:r>
-      <w:r>
-        <w:rPr>
-          <w:i/>
-          <w:iCs/>
-          <w:color w:val="000000"/>
-          <w:sz w:val="20"/>
-        </w:rPr>
-        <w:t xml:space="preserve"> I have performed a meta-analysis with the model which will be published elsewhere, so supporting the statement with a meta-analysis in this paper is unfortunately beyond its scope.</w:t>
-      </w:r>
-      <w:r>
-        <w:rPr>
-          <w:i/>
-          <w:iCs/>
-          <w:color w:val="000000"/>
-          <w:sz w:val="20"/>
-        </w:rPr>
-        <w:t xml:space="preserve"> </w:t>
-      </w:r>
-      <w:r>
-        <w:rPr>
-          <w:i/>
-          <w:iCs/>
-          <w:color w:val="000000"/>
-          <w:sz w:val="20"/>
-        </w:rPr>
-        <w:t>I have removed the statement</w:t>
-      </w:r>
-      <w:r>
-        <w:rPr>
-          <w:i/>
-          <w:iCs/>
-          <w:color w:val="000000"/>
-          <w:sz w:val="20"/>
-        </w:rPr>
-        <w:t xml:space="preserve"> in question</w:t>
-      </w:r>
-      <w:r>
-        <w:rPr>
-          <w:i/>
-          <w:iCs/>
-          <w:color w:val="000000"/>
-          <w:sz w:val="20"/>
-        </w:rPr>
-        <w:t xml:space="preserve"> and reworded accordingly</w:t>
-      </w:r>
-      <w:r>
-        <w:rPr>
-          <w:i/>
-          <w:iCs/>
-          <w:color w:val="000000"/>
-          <w:sz w:val="20"/>
-        </w:rPr>
-        <w:t>.</w:t>
-      </w:r>
-    </w:p>
-    <w:p>
-      <w:pPr>
-        <w:jc w:val="left"/>
-        <w:rPr>
-          <w:color w:val="000000"/>
-          <w:sz w:val="20"/>
-        </w:rPr>
-      </w:pPr>
-    </w:p>
-    <w:p>
-      <w:pPr>
-        <w:jc w:val="left"/>
-        <w:rPr>
-          <w:color w:val="000000"/>
-          <w:sz w:val="20"/>
-        </w:rPr>
-      </w:pPr>
-      <w:r>
-        <w:rPr>
-          <w:color w:val="000000"/>
-          <w:sz w:val="20"/>
-        </w:rPr>
-        <w:t>Major comments</w:t>
-      </w:r>
-      <w:r>
-        <w:rPr>
-          <w:color w:val="000000"/>
-          <w:sz w:val="20"/>
-        </w:rPr>
-        <w:br/>
-        <w:t>1. Identifiability and interpretation of μ (transition time / photosynthetic 'death')</w:t>
-      </w:r>
-      <w:r>
-        <w:rPr>
-          <w:color w:val="000000"/>
-          <w:sz w:val="20"/>
-        </w:rPr>
-        <w:br/>
-        <w:t>μ governs the timing of the logistic transition in k(t) and is interpreted as the time at which detrital photosynthesis ceases to matter. In at least one key example, μ appears to be weakly informed by the observation window. In the Desmarestia anceps example, the manuscript reports μ on the order of many hundreds of days, whilst the time axis shown in the corresponding figure spans a substantially shorter period. Importantly, the manuscript notes that the experimental duration is not long enough to inform τ for the control treatment, which strengthens the concern that μ may also be poorly identified when the transition sits outside the observed window.</w:t>
-      </w:r>
-      <w:r>
-        <w:rPr>
-          <w:color w:val="000000"/>
-          <w:sz w:val="20"/>
-        </w:rPr>
-        <w:t xml:space="preserve"> </w:t>
-      </w:r>
-      <w:r>
-        <w:rPr>
-          <w:color w:val="000000"/>
-          <w:sz w:val="20"/>
-        </w:rPr>
-        <w:t>Please add (i) explicit identifiability diagnostics (pair plots/correlations for μ-τ and μ-α, trace plots, ESS/Rhat), and (ii) a brief sensitivity analysis for the prior on μ (at least two reasonable priors), reporting impact on τ and on predictive trajectories. Where μ clearly exceeds the experimental duration, please clarify how it should be interpreted ecologically (e.g., 'transition not observed / not estimable within study duration') to avoid over</w:t>
-      </w:r>
-      <w:r>
-        <w:rPr>
-          <w:color w:val="000000"/>
-          <w:sz w:val="20"/>
-        </w:rPr>
-        <w:noBreakHyphen/>
-        <w:t>interpretation.</w:t>
-      </w:r>
-    </w:p>
-    <w:p>
-      <w:pPr>
-        <w:jc w:val="left"/>
-        <w:rPr>
-          <w:color w:val="000000"/>
-          <w:sz w:val="20"/>
-        </w:rPr>
-      </w:pPr>
-    </w:p>
-    <w:p>
-      <w:pPr>
-        <w:jc w:val="left"/>
-        <w:rPr>
-          <w:i/>
-          <w:iCs/>
-          <w:color w:val="000000"/>
-          <w:sz w:val="20"/>
-        </w:rPr>
-      </w:pPr>
-      <w:r>
-        <w:rPr>
-          <w:i/>
-          <w:iCs/>
-          <w:color w:val="000000"/>
-          <w:sz w:val="20"/>
-        </w:rPr>
-        <w:t xml:space="preserve">Correct, µ is not identifiable if the experimental duration is of insufficient length. </w:t>
-      </w:r>
-      <w:r>
-        <w:rPr>
-          <w:i/>
-          <w:iCs/>
-          <w:color w:val="000000"/>
-          <w:sz w:val="20"/>
-        </w:rPr>
-        <w:t>P</w:t>
-      </w:r>
-      <w:r>
-        <w:rPr>
-          <w:i/>
-          <w:iCs/>
-          <w:color w:val="000000"/>
-          <w:sz w:val="20"/>
-        </w:rPr>
-        <w:t xml:space="preserve">air plots and trace rank plots </w:t>
-      </w:r>
-      <w:r>
-        <w:rPr>
-          <w:i/>
-          <w:iCs/>
-          <w:color w:val="000000"/>
-          <w:sz w:val="20"/>
-        </w:rPr>
-        <w:t xml:space="preserve">are now </w:t>
-      </w:r>
-      <w:r>
-        <w:rPr>
-          <w:i/>
-          <w:iCs/>
-          <w:color w:val="000000"/>
-          <w:sz w:val="20"/>
-        </w:rPr>
-        <w:t>in the repository</w:t>
-      </w:r>
-      <w:r>
-        <w:rPr>
-          <w:i/>
-          <w:iCs/>
-          <w:color w:val="000000"/>
-          <w:sz w:val="20"/>
-        </w:rPr>
-        <w:t xml:space="preserve"> (these were initially just plotted in the script and not saved)</w:t>
-      </w:r>
-      <w:r>
-        <w:rPr>
-          <w:i/>
-          <w:iCs/>
-          <w:color w:val="000000"/>
-          <w:sz w:val="20"/>
-        </w:rPr>
-        <w:t xml:space="preserve">. I believe </w:t>
-      </w:r>
-      <w:r>
-        <w:rPr>
-          <w:i/>
-          <w:iCs/>
-          <w:color w:val="000000"/>
-          <w:sz w:val="20"/>
-        </w:rPr>
-        <w:t>these diagnostic</w:t>
-      </w:r>
-      <w:r>
-        <w:rPr>
-          <w:i/>
-          <w:iCs/>
-          <w:color w:val="000000"/>
-          <w:sz w:val="20"/>
-        </w:rPr>
-        <w:t>s</w:t>
-      </w:r>
-      <w:r>
-        <w:rPr>
-          <w:i/>
-          <w:iCs/>
-          <w:color w:val="000000"/>
-          <w:sz w:val="20"/>
-        </w:rPr>
-        <w:t xml:space="preserve"> </w:t>
-      </w:r>
-      <w:r>
-        <w:rPr>
-          <w:i/>
-          <w:iCs/>
-          <w:color w:val="000000"/>
-          <w:sz w:val="20"/>
-        </w:rPr>
-        <w:t xml:space="preserve">do not warrant inclusion </w:t>
-      </w:r>
-      <w:r>
-        <w:rPr>
-          <w:i/>
-          <w:iCs/>
-          <w:color w:val="000000"/>
-          <w:sz w:val="20"/>
-        </w:rPr>
-        <w:t>as s</w:t>
-      </w:r>
-      <w:r>
-        <w:rPr>
-          <w:i/>
-          <w:iCs/>
-          <w:color w:val="000000"/>
-          <w:sz w:val="20"/>
-        </w:rPr>
-        <w:t>upplement</w:t>
-      </w:r>
-      <w:r>
-        <w:rPr>
-          <w:i/>
-          <w:iCs/>
-          <w:color w:val="000000"/>
-          <w:sz w:val="20"/>
-        </w:rPr>
-        <w:t>ary figures</w:t>
-      </w:r>
-      <w:r>
-        <w:rPr>
-          <w:i/>
-          <w:iCs/>
-          <w:color w:val="000000"/>
-          <w:sz w:val="20"/>
-        </w:rPr>
-        <w:t>,</w:t>
-      </w:r>
-      <w:r>
-        <w:rPr>
-          <w:i/>
-          <w:iCs/>
-          <w:color w:val="000000"/>
-          <w:sz w:val="20"/>
-        </w:rPr>
-        <w:t xml:space="preserve"> but I explicitly refer the reader to</w:t>
-      </w:r>
-      <w:r>
-        <w:rPr>
-          <w:i/>
-          <w:iCs/>
-          <w:color w:val="000000"/>
-          <w:sz w:val="20"/>
-        </w:rPr>
-        <w:t xml:space="preserve"> the repository</w:t>
-      </w:r>
-      <w:r>
-        <w:rPr>
-          <w:i/>
-          <w:iCs/>
-          <w:color w:val="000000"/>
-          <w:sz w:val="20"/>
-        </w:rPr>
-        <w:t>.</w:t>
-      </w:r>
-    </w:p>
-    <w:p>
-      <w:pPr>
-        <w:jc w:val="left"/>
-        <w:rPr>
-          <w:i/>
-          <w:iCs/>
-          <w:color w:val="000000"/>
-          <w:sz w:val="20"/>
-        </w:rPr>
-      </w:pPr>
-    </w:p>
-    <w:p>
-      <w:pPr>
-        <w:jc w:val="left"/>
-        <w:rPr>
-          <w:i/>
-          <w:iCs/>
-          <w:color w:val="000000"/>
-          <w:sz w:val="20"/>
-        </w:rPr>
-      </w:pPr>
-      <w:r>
-        <w:rPr>
-          <w:i/>
-          <w:iCs/>
-          <w:color w:val="000000"/>
-          <w:sz w:val="20"/>
-        </w:rPr>
         <w:t xml:space="preserve">The most intuitive term for µ is “photosynthetic half-life”. I was initially reluctant to use this term because mathematically µ is not </w:t>
       </w:r>
       <w:r>
@@ -1205,7 +1724,16 @@
           <w:color w:val="000000"/>
           <w:sz w:val="20"/>
         </w:rPr>
-        <w:t xml:space="preserve"> sense.</w:t>
+        <w:t xml:space="preserve"> sense</w:t>
+      </w:r>
+      <w:r>
+        <w:rPr>
+          <w:i/>
+          <w:iCs/>
+          <w:color w:val="000000"/>
+          <w:sz w:val="20"/>
+        </w:rPr>
+        <w:t xml:space="preserve"> and I already use this term in another publication under review.</w:t>
       </w:r>
     </w:p>
     <w:p>
@@ -1244,7 +1772,23 @@
           <w:sz w:val="20"/>
         </w:rPr>
         <w:noBreakHyphen/>
-        <w:t>identifiability you fix the logistic steepness via rμ = 5, yielding a three</w:t>
+        <w:t xml:space="preserve">identifiability you fix the logistic steepness via </w:t>
+      </w:r>
+      <w:proofErr w:type="spellStart"/>
+      <w:r>
+        <w:rPr>
+          <w:color w:val="000000"/>
+          <w:sz w:val="20"/>
+        </w:rPr>
+        <w:t>rμ</w:t>
+      </w:r>
+      <w:proofErr w:type="spellEnd"/>
+      <w:r>
+        <w:rPr>
+          <w:color w:val="000000"/>
+          <w:sz w:val="20"/>
+        </w:rPr>
+        <w:t xml:space="preserve"> = 5, yielding a three</w:t>
       </w:r>
       <w:r>
         <w:rPr>
@@ -1266,7 +1810,39 @@
           <w:color w:val="000000"/>
           <w:sz w:val="20"/>
         </w:rPr>
-        <w:t>Please, (i) provide a clearer justification for the constant '5' (convention vs biological assumption), and (ii) run a small robustness check on 1-2 representative datasets allowing r to be estimated under a regularising prior (or a hierarchical structure by dataset), and compare predictive performance and parameter stability.</w:t>
+        <w:t>Please, (</w:t>
+      </w:r>
+      <w:proofErr w:type="spellStart"/>
+      <w:r>
+        <w:rPr>
+          <w:color w:val="000000"/>
+          <w:sz w:val="20"/>
+        </w:rPr>
+        <w:t>i</w:t>
+      </w:r>
+      <w:proofErr w:type="spellEnd"/>
+      <w:r>
+        <w:rPr>
+          <w:color w:val="000000"/>
+          <w:sz w:val="20"/>
+        </w:rPr>
+        <w:t>) provide a clearer justification for the constant '5' (convention vs biological assumption), and (ii) run a small robustness check on 1-2 representative datasets allowing r to be estimated under a regularising prior (or a hierarchical structure by dataset</w:t>
+      </w:r>
+      <w:proofErr w:type="gramStart"/>
+      <w:r>
+        <w:rPr>
+          <w:color w:val="000000"/>
+          <w:sz w:val="20"/>
+        </w:rPr>
+        <w:t>), and</w:t>
+      </w:r>
+      <w:proofErr w:type="gramEnd"/>
+      <w:r>
+        <w:rPr>
+          <w:color w:val="000000"/>
+          <w:sz w:val="20"/>
+        </w:rPr>
+        <w:t xml:space="preserve"> compare predictive performance and parameter stability.</w:t>
       </w:r>
     </w:p>
     <w:p>
@@ -1282,10 +1858,80 @@
       <w:pPr>
         <w:jc w:val="left"/>
         <w:rPr>
-          <w:color w:val="000000"/>
-          <w:sz w:val="20"/>
-        </w:rPr>
-      </w:pPr>
+          <w:i/>
+          <w:iCs/>
+          <w:color w:val="000000"/>
+          <w:sz w:val="20"/>
+        </w:rPr>
+      </w:pPr>
+      <w:r>
+        <w:rPr>
+          <w:i/>
+          <w:iCs/>
+          <w:color w:val="000000"/>
+          <w:sz w:val="20"/>
+        </w:rPr>
+        <w:t>I rewrote the conceptual reasoning behind fixing the logistic intercept at 5</w:t>
+      </w:r>
+      <w:r>
+        <w:rPr>
+          <w:i/>
+          <w:iCs/>
+          <w:color w:val="000000"/>
+          <w:sz w:val="20"/>
+        </w:rPr>
+        <w:t>, added the alternative parametrisation as Figure S1 for comparison with Figure 1, and provide performance tests in Table S1.</w:t>
+      </w:r>
+      <w:r>
+        <w:rPr>
+          <w:i/>
+          <w:iCs/>
+          <w:color w:val="000000"/>
+          <w:sz w:val="20"/>
+        </w:rPr>
+        <w:t xml:space="preserve"> </w:t>
+      </w:r>
+      <w:r>
+        <w:rPr>
+          <w:i/>
+          <w:iCs/>
+          <w:color w:val="000000"/>
+          <w:sz w:val="20"/>
+        </w:rPr>
+        <w:t xml:space="preserve">These are discussed in the new section </w:t>
+      </w:r>
+      <w:r>
+        <w:rPr>
+          <w:color w:val="000000"/>
+          <w:sz w:val="20"/>
+        </w:rPr>
+        <w:t>Parameterisation of k(t)</w:t>
+      </w:r>
+      <w:r>
+        <w:rPr>
+          <w:i/>
+          <w:iCs/>
+          <w:color w:val="000000"/>
+          <w:sz w:val="20"/>
+        </w:rPr>
+        <w:t xml:space="preserve"> in </w:t>
+      </w:r>
+      <w:r>
+        <w:rPr>
+          <w:color w:val="000000"/>
+          <w:sz w:val="20"/>
+        </w:rPr>
+        <w:t>Statistical model</w:t>
+      </w:r>
+      <w:r>
+        <w:rPr>
+          <w:i/>
+          <w:iCs/>
+          <w:color w:val="000000"/>
+          <w:sz w:val="20"/>
+        </w:rPr>
+        <w:t xml:space="preserve">. </w:t>
+      </w:r>
     </w:p>
     <w:p>
       <w:pPr>
@@ -1331,7 +1977,55 @@
           <w:color w:val="000000"/>
           <w:sz w:val="20"/>
         </w:rPr>
-        <w:t>Request: please include posterior predictive checks focused on (i) tail behaviour for m &gt; 1, (ii) behaviour near 0, and (iii) the dispersion pattern over time (in combination with ν(t)). In addition, please compare beta prime against at least one plausible alternative (e.g., lognormal error on m, or modelling absolute mass with explicit measurement error in M(0)) on 1-2 datasets using a predictive metric (e.g., PSIS</w:t>
+        <w:t>Request: please include posterior predictive checks focused on (</w:t>
+      </w:r>
+      <w:proofErr w:type="spellStart"/>
+      <w:r>
+        <w:rPr>
+          <w:color w:val="000000"/>
+          <w:sz w:val="20"/>
+        </w:rPr>
+        <w:t>i</w:t>
+      </w:r>
+      <w:proofErr w:type="spellEnd"/>
+      <w:r>
+        <w:rPr>
+          <w:color w:val="000000"/>
+          <w:sz w:val="20"/>
+        </w:rPr>
+        <w:t xml:space="preserve">) tail behaviour </w:t>
+      </w:r>
+      <w:proofErr w:type="spellStart"/>
+      <w:r>
+        <w:rPr>
+          <w:color w:val="000000"/>
+          <w:sz w:val="20"/>
+        </w:rPr>
+        <w:t>for m</w:t>
+      </w:r>
+      <w:proofErr w:type="spellEnd"/>
+      <w:r>
+        <w:rPr>
+          <w:color w:val="000000"/>
+          <w:sz w:val="20"/>
+        </w:rPr>
+        <w:t xml:space="preserve"> &gt; 1, (ii) behaviour near 0, and (iii) the dispersion pattern over time (in combination with ν(t)). In addition, please compare beta prime against at least one plausible alternative (e.g., lognormal error on m, or modelling absolute mass with explicit measurement error in </w:t>
+      </w:r>
+      <w:proofErr w:type="gramStart"/>
+      <w:r>
+        <w:rPr>
+          <w:color w:val="000000"/>
+          <w:sz w:val="20"/>
+        </w:rPr>
+        <w:t>M(</w:t>
+      </w:r>
+      <w:proofErr w:type="gramEnd"/>
+      <w:r>
+        <w:rPr>
+          <w:color w:val="000000"/>
+          <w:sz w:val="20"/>
+        </w:rPr>
+        <w:t>0)) on 1-2 datasets using a predictive metric (e.g., PSIS</w:t>
       </w:r>
       <w:r>
         <w:rPr>
@@ -1353,7 +2047,350 @@
           <w:color w:val="000000"/>
           <w:sz w:val="20"/>
         </w:rPr>
-        <w:t>Minor but important: please avoid reusing α both as a biological parameter and as a beta prime shape parameter—rename distributional shapes (e.g., a, b) to prevent confusion.</w:t>
+        <w:t xml:space="preserve">Minor but </w:t>
+      </w:r>
+      <w:r>
+        <w:rPr>
+          <w:color w:val="000000"/>
+          <w:sz w:val="20"/>
+        </w:rPr>
+        <w:lastRenderedPageBreak/>
+        <w:t>important: please avoid reusing α both as a biological parameter and as a beta prime shape parameter—rename distributional shapes (e.g., a, b) to prevent confusion.</w:t>
+      </w:r>
+    </w:p>
+    <w:p>
+      <w:pPr>
+        <w:jc w:val="left"/>
+        <w:rPr>
+          <w:color w:val="000000"/>
+          <w:sz w:val="20"/>
+        </w:rPr>
+      </w:pPr>
+    </w:p>
+    <w:p>
+      <w:pPr>
+        <w:jc w:val="left"/>
+        <w:rPr>
+          <w:i/>
+          <w:iCs/>
+          <w:color w:val="000000"/>
+          <w:sz w:val="20"/>
+        </w:rPr>
+      </w:pPr>
+      <w:r>
+        <w:rPr>
+          <w:i/>
+          <w:iCs/>
+          <w:color w:val="000000"/>
+          <w:sz w:val="20"/>
+        </w:rPr>
+        <w:t>I also</w:t>
+      </w:r>
+      <w:r>
+        <w:rPr>
+          <w:i/>
+          <w:iCs/>
+          <w:color w:val="000000"/>
+          <w:sz w:val="20"/>
+        </w:rPr>
+        <w:t xml:space="preserve"> added performance tests for the likelihood. These are </w:t>
+      </w:r>
+      <w:r>
+        <w:rPr>
+          <w:i/>
+          <w:iCs/>
+          <w:color w:val="000000"/>
+          <w:sz w:val="20"/>
+        </w:rPr>
+        <w:t xml:space="preserve">presented </w:t>
+      </w:r>
+      <w:r>
+        <w:rPr>
+          <w:i/>
+          <w:iCs/>
+          <w:color w:val="000000"/>
+          <w:sz w:val="20"/>
+        </w:rPr>
+        <w:t>in Table S2</w:t>
+      </w:r>
+      <w:r>
+        <w:rPr>
+          <w:i/>
+          <w:iCs/>
+          <w:color w:val="000000"/>
+          <w:sz w:val="20"/>
+        </w:rPr>
+        <w:t xml:space="preserve"> </w:t>
+      </w:r>
+      <w:r>
+        <w:rPr>
+          <w:i/>
+          <w:iCs/>
+          <w:color w:val="000000"/>
+          <w:sz w:val="20"/>
+        </w:rPr>
+        <w:t xml:space="preserve">and discussed in the new section </w:t>
+      </w:r>
+      <w:r>
+        <w:rPr>
+          <w:color w:val="000000"/>
+          <w:sz w:val="20"/>
+        </w:rPr>
+        <w:t>Likelihood</w:t>
+      </w:r>
+      <w:r>
+        <w:rPr>
+          <w:i/>
+          <w:iCs/>
+          <w:color w:val="000000"/>
+          <w:sz w:val="20"/>
+        </w:rPr>
+        <w:t xml:space="preserve"> in </w:t>
+      </w:r>
+      <w:r>
+        <w:rPr>
+          <w:color w:val="000000"/>
+          <w:sz w:val="20"/>
+        </w:rPr>
+        <w:t>Statistical model</w:t>
+      </w:r>
+      <w:r>
+        <w:rPr>
+          <w:i/>
+          <w:iCs/>
+          <w:color w:val="000000"/>
+          <w:sz w:val="20"/>
+        </w:rPr>
+        <w:t xml:space="preserve">. </w:t>
+      </w:r>
+    </w:p>
+    <w:p>
+      <w:pPr>
+        <w:jc w:val="left"/>
+        <w:rPr>
+          <w:i/>
+          <w:iCs/>
+          <w:color w:val="000000"/>
+          <w:sz w:val="20"/>
+        </w:rPr>
+      </w:pPr>
+    </w:p>
+    <w:p>
+      <w:pPr>
+        <w:jc w:val="left"/>
+        <w:rPr>
+          <w:i/>
+          <w:iCs/>
+          <w:color w:val="000000"/>
+          <w:sz w:val="20"/>
+        </w:rPr>
+      </w:pPr>
+      <w:r>
+        <w:rPr>
+          <w:i/>
+          <w:iCs/>
+          <w:color w:val="000000"/>
+          <w:sz w:val="20"/>
+        </w:rPr>
+        <w:t xml:space="preserve">Some parameter names are unfortunately bound to be repeated, e.g. </w:t>
+      </w:r>
+      <w:r>
+        <w:rPr>
+          <w:i/>
+          <w:iCs/>
+          <w:color w:val="000000"/>
+          <w:sz w:val="20"/>
+        </w:rPr>
+        <w:t>μ</w:t>
+      </w:r>
+      <w:r>
+        <w:rPr>
+          <w:i/>
+          <w:iCs/>
+          <w:color w:val="000000"/>
+          <w:sz w:val="20"/>
+        </w:rPr>
+        <w:t xml:space="preserve">, </w:t>
+      </w:r>
+      <w:r>
+        <w:rPr>
+          <w:i/>
+          <w:iCs/>
+          <w:color w:val="000000"/>
+          <w:sz w:val="20"/>
+        </w:rPr>
+        <w:t>σ</w:t>
+      </w:r>
+      <w:r>
+        <w:rPr>
+          <w:i/>
+          <w:iCs/>
+          <w:color w:val="000000"/>
+          <w:sz w:val="20"/>
+        </w:rPr>
+        <w:t>,</w:t>
+      </w:r>
+      <w:r>
+        <w:t xml:space="preserve"> </w:t>
+      </w:r>
+      <w:r>
+        <w:rPr>
+          <w:i/>
+          <w:iCs/>
+          <w:color w:val="000000"/>
+          <w:sz w:val="20"/>
+        </w:rPr>
+        <w:t>α</w:t>
+      </w:r>
+      <w:r>
+        <w:rPr>
+          <w:i/>
+          <w:iCs/>
+          <w:color w:val="000000"/>
+          <w:sz w:val="20"/>
+        </w:rPr>
+        <w:t>,</w:t>
+      </w:r>
+      <w:r>
+        <w:t xml:space="preserve"> </w:t>
+      </w:r>
+      <w:r>
+        <w:rPr>
+          <w:i/>
+          <w:iCs/>
+          <w:color w:val="000000"/>
+          <w:sz w:val="20"/>
+        </w:rPr>
+        <w:t>β</w:t>
+      </w:r>
+      <w:r>
+        <w:rPr>
+          <w:i/>
+          <w:iCs/>
+          <w:color w:val="000000"/>
+          <w:sz w:val="20"/>
+        </w:rPr>
+        <w:t xml:space="preserve">. There are no other accepted symbols for the shape parameters </w:t>
+      </w:r>
+      <w:r>
+        <w:rPr>
+          <w:i/>
+          <w:iCs/>
+          <w:color w:val="000000"/>
+          <w:sz w:val="20"/>
+        </w:rPr>
+        <w:t>α</w:t>
+      </w:r>
+      <w:r>
+        <w:rPr>
+          <w:i/>
+          <w:iCs/>
+          <w:color w:val="000000"/>
+          <w:sz w:val="20"/>
+        </w:rPr>
+        <w:t xml:space="preserve"> and</w:t>
+      </w:r>
+      <w:r>
+        <w:t xml:space="preserve"> </w:t>
+      </w:r>
+      <w:r>
+        <w:rPr>
+          <w:i/>
+          <w:iCs/>
+          <w:color w:val="000000"/>
+          <w:sz w:val="20"/>
+        </w:rPr>
+        <w:t>β</w:t>
+      </w:r>
+      <w:r>
+        <w:rPr>
+          <w:color w:val="000000"/>
+          <w:sz w:val="20"/>
+        </w:rPr>
+        <w:t xml:space="preserve"> of the beta and beta prime distributions</w:t>
+      </w:r>
+      <w:r>
+        <w:rPr>
+          <w:i/>
+          <w:iCs/>
+          <w:color w:val="000000"/>
+          <w:sz w:val="20"/>
+        </w:rPr>
+        <w:t xml:space="preserve">, or for the mean, </w:t>
+      </w:r>
+      <w:proofErr w:type="spellStart"/>
+      <w:r>
+        <w:rPr>
+          <w:i/>
+          <w:iCs/>
+          <w:color w:val="000000"/>
+          <w:sz w:val="20"/>
+        </w:rPr>
+        <w:t>sd</w:t>
+      </w:r>
+      <w:proofErr w:type="spellEnd"/>
+      <w:r>
+        <w:rPr>
+          <w:i/>
+          <w:iCs/>
+          <w:color w:val="000000"/>
+          <w:sz w:val="20"/>
+        </w:rPr>
+        <w:t xml:space="preserve">, variance etc. In each case I take care to avoid confusion by redefining what I mean in the given context (e.g. “the sample mean </w:t>
+      </w:r>
+      <w:r>
+        <w:rPr>
+          <w:i/>
+          <w:iCs/>
+          <w:color w:val="000000"/>
+          <w:sz w:val="20"/>
+        </w:rPr>
+        <w:t>μ</w:t>
+      </w:r>
+      <w:r>
+        <w:rPr>
+          <w:i/>
+          <w:iCs/>
+          <w:color w:val="000000"/>
+          <w:sz w:val="20"/>
+        </w:rPr>
+        <w:t>”</w:t>
+      </w:r>
+      <w:r>
+        <w:rPr>
+          <w:i/>
+          <w:iCs/>
+          <w:color w:val="000000"/>
+          <w:sz w:val="20"/>
+        </w:rPr>
+        <w:t xml:space="preserve"> vs. “the photosynthetic half-life </w:t>
+      </w:r>
+      <w:r>
+        <w:rPr>
+          <w:i/>
+          <w:iCs/>
+          <w:color w:val="000000"/>
+          <w:sz w:val="20"/>
+        </w:rPr>
+        <w:t>μ</w:t>
+      </w:r>
+      <w:r>
+        <w:rPr>
+          <w:i/>
+          <w:iCs/>
+          <w:color w:val="000000"/>
+          <w:sz w:val="20"/>
+        </w:rPr>
+        <w:t>”</w:t>
+      </w:r>
+      <w:r>
+        <w:rPr>
+          <w:i/>
+          <w:iCs/>
+          <w:color w:val="000000"/>
+          <w:sz w:val="20"/>
+        </w:rPr>
+        <w:t>).</w:t>
       </w:r>
     </w:p>
     <w:p>
@@ -1400,7 +2437,23 @@
           <w:sz w:val="20"/>
         </w:rPr>
         <w:br/>
-        <w:t>ν(t) = (ε − θ) e^(−λ t) + θ</w:t>
+        <w:t>ν(t) = (ε − θ) e</w:t>
+      </w:r>
+      <w:proofErr w:type="gramStart"/>
+      <w:r>
+        <w:rPr>
+          <w:color w:val="000000"/>
+          <w:sz w:val="20"/>
+        </w:rPr>
+        <w:t>^(</w:t>
+      </w:r>
+      <w:proofErr w:type="gramEnd"/>
+      <w:r>
+        <w:rPr>
+          <w:color w:val="000000"/>
+          <w:sz w:val="20"/>
+        </w:rPr>
+        <w:t>−λ t) + θ</w:t>
       </w:r>
       <w:r>
         <w:rPr>
@@ -1408,7 +2461,23 @@
           <w:sz w:val="20"/>
         </w:rPr>
         <w:br/>
-        <w:t>motivated by minimal uncertainty at t = 0 because m(0) = 1.</w:t>
+        <w:t xml:space="preserve">motivated by minimal uncertainty at t = 0 because </w:t>
+      </w:r>
+      <w:proofErr w:type="gramStart"/>
+      <w:r>
+        <w:rPr>
+          <w:color w:val="000000"/>
+          <w:sz w:val="20"/>
+        </w:rPr>
+        <w:t>m(</w:t>
+      </w:r>
+      <w:proofErr w:type="gramEnd"/>
+      <w:r>
+        <w:rPr>
+          <w:color w:val="000000"/>
+          <w:sz w:val="20"/>
+        </w:rPr>
+        <w:t>0) = 1.</w:t>
       </w:r>
       <w:r>
         <w:rPr>
@@ -1436,15 +2505,23 @@
           <w:color w:val="000000"/>
           <w:sz w:val="20"/>
         </w:rPr>
-        <w:t xml:space="preserve">Please (i) provide posterior predictive checks demonstrating that the model reproduces the observed spread of m through time, and (ii) include a simple sensitivity </w:t>
-      </w:r>
-      <w:r>
-        <w:rPr>
-          <w:color w:val="000000"/>
-          <w:sz w:val="20"/>
-        </w:rPr>
-        <w:lastRenderedPageBreak/>
-        <w:t>comparison to a constant</w:t>
+        <w:t>Please (</w:t>
+      </w:r>
+      <w:proofErr w:type="spellStart"/>
+      <w:r>
+        <w:rPr>
+          <w:color w:val="000000"/>
+          <w:sz w:val="20"/>
+        </w:rPr>
+        <w:t>i</w:t>
+      </w:r>
+      <w:proofErr w:type="spellEnd"/>
+      <w:r>
+        <w:rPr>
+          <w:color w:val="000000"/>
+          <w:sz w:val="20"/>
+        </w:rPr>
+        <w:t>) provide posterior predictive checks demonstrating that the model reproduces the observed spread of m through time, and (ii) include a simple sensitivity comparison to a constant</w:t>
       </w:r>
       <w:r>
         <w:rPr>
@@ -1463,12 +2540,90 @@
           <w:sz w:val="20"/>
         </w:rPr>
       </w:pPr>
-      <w:r>
-        <w:rPr>
+    </w:p>
+    <w:p>
+      <w:pPr>
+        <w:jc w:val="left"/>
+        <w:rPr>
+          <w:i/>
+          <w:iCs/>
+          <w:color w:val="000000"/>
+          <w:sz w:val="20"/>
+        </w:rPr>
+      </w:pPr>
+      <w:r>
+        <w:rPr>
+          <w:i/>
+          <w:iCs/>
+          <w:color w:val="000000"/>
+          <w:sz w:val="20"/>
+        </w:rPr>
+        <w:t>I added performance tests for modelling heteroskedasticity. See Table S3</w:t>
+      </w:r>
+      <w:r>
+        <w:rPr>
+          <w:i/>
+          <w:iCs/>
+          <w:color w:val="000000"/>
+          <w:sz w:val="20"/>
+        </w:rPr>
+        <w:t xml:space="preserve"> and new section </w:t>
+      </w:r>
+      <w:r>
+        <w:rPr>
+          <w:color w:val="000000"/>
+          <w:sz w:val="20"/>
+        </w:rPr>
+        <w:t>Heteroskedasticity</w:t>
+      </w:r>
+      <w:r>
+        <w:rPr>
+          <w:i/>
+          <w:iCs/>
+          <w:color w:val="000000"/>
+          <w:sz w:val="20"/>
+        </w:rPr>
+        <w:t xml:space="preserve"> in </w:t>
+      </w:r>
+      <w:r>
+        <w:rPr>
+          <w:color w:val="000000"/>
+          <w:sz w:val="20"/>
+        </w:rPr>
+        <w:t>Statistical model</w:t>
+      </w:r>
+      <w:r>
+        <w:rPr>
+          <w:i/>
+          <w:iCs/>
+          <w:color w:val="000000"/>
+          <w:sz w:val="20"/>
+        </w:rPr>
+        <w:t>.</w:t>
+      </w:r>
+    </w:p>
+    <w:p>
+      <w:pPr>
+        <w:jc w:val="left"/>
+        <w:rPr>
+          <w:color w:val="000000"/>
+          <w:sz w:val="20"/>
+        </w:rPr>
+      </w:pPr>
+      <w:r>
+        <w:rPr>
+          <w:i/>
+          <w:iCs/>
           <w:color w:val="000000"/>
           <w:sz w:val="20"/>
         </w:rPr>
         <w:br/>
+      </w:r>
+      <w:r>
+        <w:rPr>
+          <w:color w:val="000000"/>
+          <w:sz w:val="20"/>
+        </w:rPr>
         <w:t>5. Formal validation against standard models to support synthesis/meta</w:t>
       </w:r>
       <w:r>
@@ -1505,7 +2660,39 @@
           <w:color w:val="000000"/>
           <w:sz w:val="20"/>
         </w:rPr>
-        <w:t>For 2-3 representative datasets, please fit and compare: (i) the standard exponential model m(t) = e^(−k t), (ii) a simple alternative allowing early increase/plateau (even ad hoc), and (iii) the proposed model. Report predictive performance (e.g., PSIS</w:t>
+        <w:t>For 2-3 representative datasets, please fit and compare: (</w:t>
+      </w:r>
+      <w:proofErr w:type="spellStart"/>
+      <w:r>
+        <w:rPr>
+          <w:color w:val="000000"/>
+          <w:sz w:val="20"/>
+        </w:rPr>
+        <w:t>i</w:t>
+      </w:r>
+      <w:proofErr w:type="spellEnd"/>
+      <w:r>
+        <w:rPr>
+          <w:color w:val="000000"/>
+          <w:sz w:val="20"/>
+        </w:rPr>
+        <w:t>) the standard exponential model m(t) = e</w:t>
+      </w:r>
+      <w:proofErr w:type="gramStart"/>
+      <w:r>
+        <w:rPr>
+          <w:color w:val="000000"/>
+          <w:sz w:val="20"/>
+        </w:rPr>
+        <w:t>^(</w:t>
+      </w:r>
+      <w:proofErr w:type="gramEnd"/>
+      <w:r>
+        <w:rPr>
+          <w:color w:val="000000"/>
+          <w:sz w:val="20"/>
+        </w:rPr>
+        <w:t>−k t), (ii) a simple alternative allowing early increase/plateau (even ad hoc), and (iii) the proposed model. Report predictive performance (e.g., PSIS</w:t>
       </w:r>
       <w:r>
         <w:rPr>
@@ -1584,6 +2771,142 @@
           <w:sz w:val="20"/>
         </w:rPr>
       </w:pPr>
+    </w:p>
+    <w:p>
+      <w:pPr>
+        <w:jc w:val="left"/>
+        <w:rPr>
+          <w:i/>
+          <w:iCs/>
+          <w:color w:val="000000"/>
+          <w:sz w:val="20"/>
+        </w:rPr>
+      </w:pPr>
+      <w:r>
+        <w:rPr>
+          <w:i/>
+          <w:iCs/>
+          <w:color w:val="000000"/>
+          <w:sz w:val="20"/>
+        </w:rPr>
+        <w:t xml:space="preserve">This was also </w:t>
+      </w:r>
+      <w:r>
+        <w:rPr>
+          <w:i/>
+          <w:iCs/>
+          <w:color w:val="000000"/>
+          <w:sz w:val="20"/>
+        </w:rPr>
+        <w:t xml:space="preserve">requested by </w:t>
+      </w:r>
+      <w:r>
+        <w:rPr>
+          <w:i/>
+          <w:iCs/>
+          <w:color w:val="000000"/>
+          <w:sz w:val="20"/>
+        </w:rPr>
+        <w:t>Reviewer #2</w:t>
+      </w:r>
+      <w:r>
+        <w:rPr>
+          <w:i/>
+          <w:iCs/>
+          <w:color w:val="000000"/>
+          <w:sz w:val="20"/>
+        </w:rPr>
+        <w:t>. An initial test comparison is in Table S4. I then fit the conventional model (e</w:t>
+      </w:r>
+      <w:r>
+        <w:rPr>
+          <w:i/>
+          <w:iCs/>
+          <w:color w:val="000000"/>
+          <w:sz w:val="20"/>
+          <w:vertAlign w:val="superscript"/>
+        </w:rPr>
+        <w:t>−kt</w:t>
+      </w:r>
+      <w:r>
+        <w:rPr>
+          <w:i/>
+          <w:iCs/>
+          <w:color w:val="000000"/>
+          <w:sz w:val="20"/>
+        </w:rPr>
+        <w:t>) to each example dataset to show that it is ill-fitting in most cases (cf. Figures 2–6 with S2–S6) and formally compare k and</w:t>
+      </w:r>
+      <w:r>
+        <w:t xml:space="preserve"> </w:t>
+      </w:r>
+      <w:r>
+        <w:rPr>
+          <w:i/>
+          <w:iCs/>
+          <w:color w:val="000000"/>
+          <w:sz w:val="20"/>
+        </w:rPr>
+        <w:t>τ</w:t>
+      </w:r>
+      <w:r>
+        <w:rPr>
+          <w:i/>
+          <w:iCs/>
+          <w:color w:val="000000"/>
+          <w:sz w:val="20"/>
+        </w:rPr>
+        <w:t xml:space="preserve"> as well as t</w:t>
+      </w:r>
+      <w:r>
+        <w:rPr>
+          <w:i/>
+          <w:iCs/>
+          <w:color w:val="000000"/>
+          <w:sz w:val="20"/>
+          <w:vertAlign w:val="subscript"/>
+        </w:rPr>
+        <w:t xml:space="preserve">½ </w:t>
+      </w:r>
+      <w:r>
+        <w:rPr>
+          <w:i/>
+          <w:iCs/>
+          <w:color w:val="000000"/>
+          <w:sz w:val="20"/>
+        </w:rPr>
+        <w:t>and</w:t>
+      </w:r>
+      <w:r>
+        <w:t xml:space="preserve"> </w:t>
+      </w:r>
+      <w:r>
+        <w:rPr>
+          <w:i/>
+          <w:iCs/>
+          <w:color w:val="000000"/>
+          <w:sz w:val="20"/>
+        </w:rPr>
+        <w:t>μ</w:t>
+      </w:r>
+      <w:r>
+        <w:rPr>
+          <w:i/>
+          <w:iCs/>
+          <w:color w:val="000000"/>
+          <w:sz w:val="20"/>
+        </w:rPr>
+        <w:t xml:space="preserve"> (Table 1, 2). I now use multilevel models in several examples, providing a full model description in each case, to show how to the proposed model would be used in meta-analysis.</w:t>
+      </w:r>
+    </w:p>
+    <w:p>
+      <w:pPr>
+        <w:jc w:val="left"/>
+        <w:rPr>
+          <w:color w:val="000000"/>
+          <w:sz w:val="20"/>
+        </w:rPr>
+      </w:pPr>
       <w:r>
         <w:rPr>
           <w:color w:val="000000"/>
@@ -1645,6 +2968,35 @@
           <w:sz w:val="20"/>
         </w:rPr>
       </w:pPr>
+    </w:p>
+    <w:p>
+      <w:pPr>
+        <w:jc w:val="left"/>
+        <w:rPr>
+          <w:i/>
+          <w:iCs/>
+          <w:color w:val="000000"/>
+          <w:sz w:val="20"/>
+        </w:rPr>
+      </w:pPr>
+      <w:r>
+        <w:rPr>
+          <w:i/>
+          <w:iCs/>
+          <w:color w:val="000000"/>
+          <w:sz w:val="20"/>
+        </w:rPr>
+        <w:t>I now use a measurement error model to avoid simulating data.</w:t>
+      </w:r>
+    </w:p>
+    <w:p>
+      <w:pPr>
+        <w:jc w:val="left"/>
+        <w:rPr>
+          <w:color w:val="000000"/>
+          <w:sz w:val="20"/>
+        </w:rPr>
+      </w:pPr>
       <w:r>
         <w:rPr>
           <w:color w:val="000000"/>
@@ -1706,6 +3058,15 @@
         </w:rPr>
         <w:t>See rewording of ecological interpretation of µ above.</w:t>
       </w:r>
+      <w:r>
+        <w:rPr>
+          <w:i/>
+          <w:iCs/>
+          <w:color w:val="000000"/>
+          <w:sz w:val="20"/>
+        </w:rPr>
+        <w:t xml:space="preserve"> I added the requested figure captions.</w:t>
+      </w:r>
     </w:p>
     <w:p>
       <w:pPr>
@@ -1720,6 +3081,7 @@
           <w:color w:val="000000"/>
           <w:sz w:val="20"/>
         </w:rPr>
+        <w:lastRenderedPageBreak/>
         <w:br/>
         <w:t>* Where you discuss relevance for blue carbon, please ensure wording distinguishes flux into detrital pools from net long</w:t>
       </w:r>
@@ -1745,10 +3107,95 @@
       <w:pPr>
         <w:jc w:val="left"/>
         <w:rPr>
-          <w:color w:val="000000"/>
-          <w:sz w:val="20"/>
-        </w:rPr>
-      </w:pPr>
+          <w:i/>
+          <w:iCs/>
+          <w:color w:val="000000"/>
+          <w:sz w:val="20"/>
+        </w:rPr>
+      </w:pPr>
+      <w:r>
+        <w:rPr>
+          <w:i/>
+          <w:iCs/>
+          <w:color w:val="000000"/>
+          <w:sz w:val="20"/>
+        </w:rPr>
+        <w:t xml:space="preserve">As far as I know there is no long-term seaweed sequestration. </w:t>
+      </w:r>
+      <w:r>
+        <w:rPr>
+          <w:i/>
+          <w:iCs/>
+          <w:color w:val="000000"/>
+          <w:sz w:val="20"/>
+        </w:rPr>
+        <w:t xml:space="preserve">I only use </w:t>
+      </w:r>
+      <w:r>
+        <w:rPr>
+          <w:i/>
+          <w:iCs/>
+          <w:color w:val="000000"/>
+          <w:sz w:val="20"/>
+        </w:rPr>
+        <w:t>the term “</w:t>
+      </w:r>
+      <w:r>
+        <w:rPr>
+          <w:i/>
+          <w:iCs/>
+          <w:color w:val="000000"/>
+          <w:sz w:val="20"/>
+        </w:rPr>
+        <w:t>sequestration</w:t>
+      </w:r>
+      <w:r>
+        <w:rPr>
+          <w:i/>
+          <w:iCs/>
+          <w:color w:val="000000"/>
+          <w:sz w:val="20"/>
+        </w:rPr>
+        <w:t>”</w:t>
+      </w:r>
+      <w:r>
+        <w:rPr>
+          <w:i/>
+          <w:iCs/>
+          <w:color w:val="000000"/>
+          <w:sz w:val="20"/>
+        </w:rPr>
+        <w:t xml:space="preserve"> in the introduction</w:t>
+      </w:r>
+      <w:r>
+        <w:rPr>
+          <w:i/>
+          <w:iCs/>
+          <w:color w:val="000000"/>
+          <w:sz w:val="20"/>
+        </w:rPr>
+        <w:t xml:space="preserve"> and make conclusions about decomposition having implications for estimates of seaweed blue carbon which </w:t>
+      </w:r>
+      <w:proofErr w:type="gramStart"/>
+      <w:r>
+        <w:rPr>
+          <w:i/>
+          <w:iCs/>
+          <w:color w:val="000000"/>
+          <w:sz w:val="20"/>
+        </w:rPr>
+        <w:t>by definition hinges</w:t>
+      </w:r>
+      <w:proofErr w:type="gramEnd"/>
+      <w:r>
+        <w:rPr>
+          <w:i/>
+          <w:iCs/>
+          <w:color w:val="000000"/>
+          <w:sz w:val="20"/>
+        </w:rPr>
+        <w:t xml:space="preserve"> on the detrital pool.</w:t>
+      </w:r>
     </w:p>
     <w:p>
       <w:pPr>
@@ -1793,16 +3240,16 @@
           <w:color w:val="000000"/>
           <w:sz w:val="20"/>
         </w:rPr>
-        <w:t xml:space="preserve">I will </w:t>
-      </w:r>
-      <w:r>
-        <w:rPr>
-          <w:i/>
-          <w:iCs/>
-          <w:color w:val="000000"/>
-          <w:sz w:val="20"/>
-        </w:rPr>
-        <w:t xml:space="preserve">published </w:t>
+        <w:t>I have now published</w:t>
+      </w:r>
+      <w:r>
+        <w:rPr>
+          <w:i/>
+          <w:iCs/>
+          <w:color w:val="000000"/>
+          <w:sz w:val="20"/>
+        </w:rPr>
+        <w:t xml:space="preserve"> </w:t>
       </w:r>
       <w:r>
         <w:rPr>
@@ -1847,7 +3294,27 @@
           <w:color w:val="000000"/>
           <w:sz w:val="20"/>
         </w:rPr>
-        <w:t>provide a Zenodo DOI once the review process has been finalised.</w:t>
+        <w:t xml:space="preserve">provide a </w:t>
+      </w:r>
+      <w:proofErr w:type="spellStart"/>
+      <w:r>
+        <w:rPr>
+          <w:i/>
+          <w:iCs/>
+          <w:color w:val="000000"/>
+          <w:sz w:val="20"/>
+        </w:rPr>
+        <w:t>Zenodo</w:t>
+      </w:r>
+      <w:proofErr w:type="spellEnd"/>
+      <w:r>
+        <w:rPr>
+          <w:i/>
+          <w:iCs/>
+          <w:color w:val="000000"/>
+          <w:sz w:val="20"/>
+        </w:rPr>
+        <w:t xml:space="preserve"> DOI.</w:t>
       </w:r>
     </w:p>
     <w:p>
@@ -2040,7 +3507,25 @@
           <w:color w:val="000000"/>
           <w:sz w:val="20"/>
         </w:rPr>
-        <w:t>Thanks, I fixed all these typos as requested.</w:t>
+        <w:t>Thanks, I fixed all these typos as requested</w:t>
+      </w:r>
+      <w:r>
+        <w:rPr>
+          <w:i/>
+          <w:iCs/>
+          <w:color w:val="000000"/>
+          <w:sz w:val="20"/>
+        </w:rPr>
+        <w:t xml:space="preserve"> and accept style suggestions</w:t>
+      </w:r>
+      <w:r>
+        <w:rPr>
+          <w:i/>
+          <w:iCs/>
+          <w:color w:val="000000"/>
+          <w:sz w:val="20"/>
+        </w:rPr>
+        <w:t>.</w:t>
       </w:r>
     </w:p>
     <w:p>
@@ -2085,11 +3570,11 @@
       </w:r>
     </w:p>
     <w:sectPr>
-      <w:headerReference w:type="default" r:id="rId13"/>
-      <w:footerReference w:type="even" r:id="rId14"/>
-      <w:footerReference w:type="default" r:id="rId15"/>
-      <w:headerReference w:type="first" r:id="rId16"/>
-      <w:footerReference w:type="first" r:id="rId17"/>
+      <w:headerReference w:type="default" r:id="rId14"/>
+      <w:footerReference w:type="even" r:id="rId15"/>
+      <w:footerReference w:type="default" r:id="rId16"/>
+      <w:headerReference w:type="first" r:id="rId17"/>
+      <w:footerReference w:type="first" r:id="rId18"/>
       <w:type w:val="continuous"/>
       <w:pgSz w:w="12240" w:h="15840" w:code="1"/>
       <w:pgMar w:top="1440" w:right="1440" w:bottom="1440" w:left="1440" w:header="958" w:footer="958" w:gutter="0"/>
@@ -3071,7 +4556,7 @@
   <w:style w:type="paragraph" w:default="1" w:styleId="Normal">
     <w:name w:val="Normal"/>
     <w:qFormat/>
-    <w:rsid w:val="0031597A"/>
+    <w:rsid w:val="00021EBB"/>
     <w:pPr>
       <w:jc w:val="both"/>
     </w:pPr>

</xml_diff>

<commit_message>
Scanned MS files using Bookends
</commit_message>
<xml_diff>
--- a/Manuscript/Ecological Modelling/Third submission/Response.docx
+++ b/Manuscript/Ecological Modelling/Third submission/Response.docx
@@ -1643,7 +1643,62 @@
           <w:color w:val="000000"/>
           <w:sz w:val="20"/>
         </w:rPr>
-        <w:t xml:space="preserve">equivalent to the exponential half-life (ln 2 / k) ecologists are familiar with. After considering your request for better interpretability, I have changed my mind. I believe the term is defensible because it is more intuitive than “photosynthetic death” or “midpoint of photosynthetic decay” and in the case of </w:t>
+        <w:t xml:space="preserve">equivalent to the exponential half-life </w:t>
+      </w:r>
+      <w:r>
+        <w:rPr>
+          <w:i/>
+          <w:iCs/>
+          <w:color w:val="000000"/>
+          <w:sz w:val="20"/>
+        </w:rPr>
+        <w:t>t</w:t>
+      </w:r>
+      <w:r>
+        <w:rPr>
+          <w:i/>
+          <w:iCs/>
+          <w:color w:val="000000"/>
+          <w:sz w:val="20"/>
+          <w:vertAlign w:val="subscript"/>
+        </w:rPr>
+        <w:t>½</w:t>
+      </w:r>
+      <w:r>
+        <w:rPr>
+          <w:i/>
+          <w:iCs/>
+          <w:color w:val="000000"/>
+          <w:sz w:val="20"/>
+        </w:rPr>
+        <w:t xml:space="preserve"> </w:t>
+      </w:r>
+      <w:r>
+        <w:rPr>
+          <w:i/>
+          <w:iCs/>
+          <w:color w:val="000000"/>
+          <w:sz w:val="20"/>
+        </w:rPr>
+        <w:t xml:space="preserve">(ln 2 / k) </w:t>
+      </w:r>
+      <w:r>
+        <w:rPr>
+          <w:i/>
+          <w:iCs/>
+          <w:color w:val="000000"/>
+          <w:sz w:val="20"/>
+        </w:rPr>
+        <w:t xml:space="preserve">which </w:t>
+      </w:r>
+      <w:r>
+        <w:rPr>
+          <w:i/>
+          <w:iCs/>
+          <w:color w:val="000000"/>
+          <w:sz w:val="20"/>
+        </w:rPr>
+        <w:t xml:space="preserve">ecologists are familiar with. After considering your request for better interpretability, I have changed my mind. I believe the term is defensible because it is more intuitive than “photosynthetic death” or “midpoint of photosynthetic decay” and in the case of </w:t>
       </w:r>
       <w:r>
         <w:rPr>
@@ -1697,7 +1752,35 @@
           <w:color w:val="000000"/>
           <w:sz w:val="20"/>
         </w:rPr>
-        <w:t xml:space="preserve"> is directly analogous to exponential half-life.</w:t>
+        <w:t xml:space="preserve"> is directly analogous to </w:t>
+      </w:r>
+      <w:r>
+        <w:rPr>
+          <w:i/>
+          <w:iCs/>
+          <w:color w:val="000000"/>
+          <w:sz w:val="20"/>
+        </w:rPr>
+        <w:t>t</w:t>
+      </w:r>
+      <w:r>
+        <w:rPr>
+          <w:i/>
+          <w:iCs/>
+          <w:color w:val="000000"/>
+          <w:sz w:val="20"/>
+          <w:vertAlign w:val="subscript"/>
+        </w:rPr>
+        <w:t>½</w:t>
+      </w:r>
+      <w:r>
+        <w:rPr>
+          <w:i/>
+          <w:iCs/>
+          <w:color w:val="000000"/>
+          <w:sz w:val="20"/>
+        </w:rPr>
+        <w:t>.</w:t>
       </w:r>
       <w:r>
         <w:rPr>
@@ -1733,7 +1816,16 @@
           <w:color w:val="000000"/>
           <w:sz w:val="20"/>
         </w:rPr>
-        <w:t xml:space="preserve"> and I already use this term in another publication under review.</w:t>
+        <w:t xml:space="preserve">. </w:t>
+      </w:r>
+      <w:r>
+        <w:rPr>
+          <w:i/>
+          <w:iCs/>
+          <w:color w:val="000000"/>
+          <w:sz w:val="20"/>
+        </w:rPr>
+        <w:t>I already use this term in another publication under review.</w:t>
       </w:r>
     </w:p>
     <w:p>
@@ -1880,7 +1972,25 @@
           <w:color w:val="000000"/>
           <w:sz w:val="20"/>
         </w:rPr>
-        <w:t>, added the alternative parametrisation as Figure S1 for comparison with Figure 1, and provide performance tests in Table S1.</w:t>
+        <w:t xml:space="preserve">, added the alternative </w:t>
+      </w:r>
+      <w:r>
+        <w:rPr>
+          <w:i/>
+          <w:iCs/>
+          <w:color w:val="000000"/>
+          <w:sz w:val="20"/>
+        </w:rPr>
+        <w:t xml:space="preserve">constant slope </w:t>
+      </w:r>
+      <w:r>
+        <w:rPr>
+          <w:i/>
+          <w:iCs/>
+          <w:color w:val="000000"/>
+          <w:sz w:val="20"/>
+        </w:rPr>
+        <w:t>parametrisation as Figure S1 for comparison with Figure 1, and provide performance tests in Table S1.</w:t>
       </w:r>
       <w:r>
         <w:rPr>
@@ -1916,12 +2026,28 @@
         </w:rPr>
         <w:t xml:space="preserve"> in </w:t>
       </w:r>
-      <w:r>
-        <w:rPr>
-          <w:color w:val="000000"/>
-          <w:sz w:val="20"/>
-        </w:rPr>
-        <w:t>Statistical model</w:t>
+      <w:proofErr w:type="gramStart"/>
+      <w:r>
+        <w:rPr>
+          <w:color w:val="000000"/>
+          <w:sz w:val="20"/>
+        </w:rPr>
+        <w:t>The</w:t>
+      </w:r>
+      <w:proofErr w:type="gramEnd"/>
+      <w:r>
+        <w:rPr>
+          <w:color w:val="000000"/>
+          <w:sz w:val="20"/>
+        </w:rPr>
+        <w:t xml:space="preserve"> s</w:t>
+      </w:r>
+      <w:r>
+        <w:rPr>
+          <w:color w:val="000000"/>
+          <w:sz w:val="20"/>
+        </w:rPr>
+        <w:t>tatistical model</w:t>
       </w:r>
       <w:r>
         <w:rPr>
@@ -2147,12 +2273,37 @@
         </w:rPr>
         <w:t xml:space="preserve"> in </w:t>
       </w:r>
-      <w:r>
-        <w:rPr>
-          <w:color w:val="000000"/>
-          <w:sz w:val="20"/>
-        </w:rPr>
-        <w:t>Statistical model</w:t>
+      <w:proofErr w:type="gramStart"/>
+      <w:r>
+        <w:rPr>
+          <w:color w:val="000000"/>
+          <w:sz w:val="20"/>
+        </w:rPr>
+        <w:t>The</w:t>
+      </w:r>
+      <w:proofErr w:type="gramEnd"/>
+      <w:r>
+        <w:rPr>
+          <w:i/>
+          <w:iCs/>
+          <w:color w:val="000000"/>
+          <w:sz w:val="20"/>
+        </w:rPr>
+        <w:t xml:space="preserve"> </w:t>
+      </w:r>
+      <w:r>
+        <w:rPr>
+          <w:color w:val="000000"/>
+          <w:sz w:val="20"/>
+        </w:rPr>
+        <w:t>s</w:t>
+      </w:r>
+      <w:r>
+        <w:rPr>
+          <w:color w:val="000000"/>
+          <w:sz w:val="20"/>
+        </w:rPr>
+        <w:t>tatistical model</w:t>
       </w:r>
       <w:r>
         <w:rPr>
@@ -2192,7 +2343,43 @@
           <w:color w:val="000000"/>
           <w:sz w:val="20"/>
         </w:rPr>
-        <w:t xml:space="preserve">Some parameter names are unfortunately bound to be repeated, e.g. </w:t>
+        <w:t>Some</w:t>
+      </w:r>
+      <w:r>
+        <w:rPr>
+          <w:i/>
+          <w:iCs/>
+          <w:color w:val="000000"/>
+          <w:sz w:val="20"/>
+        </w:rPr>
+        <w:t xml:space="preserve"> common</w:t>
+      </w:r>
+      <w:r>
+        <w:rPr>
+          <w:i/>
+          <w:iCs/>
+          <w:color w:val="000000"/>
+          <w:sz w:val="20"/>
+        </w:rPr>
+        <w:t xml:space="preserve"> parameter names are unfortunately bound to be repeated</w:t>
+      </w:r>
+      <w:r>
+        <w:rPr>
+          <w:i/>
+          <w:iCs/>
+          <w:color w:val="000000"/>
+          <w:sz w:val="20"/>
+        </w:rPr>
+        <w:t xml:space="preserve"> in the manuscript</w:t>
+      </w:r>
+      <w:r>
+        <w:rPr>
+          <w:i/>
+          <w:iCs/>
+          <w:color w:val="000000"/>
+          <w:sz w:val="20"/>
+        </w:rPr>
+        <w:t xml:space="preserve">, e.g. </w:t>
       </w:r>
       <w:r>
         <w:rPr>
@@ -2270,7 +2457,25 @@
           <w:color w:val="000000"/>
           <w:sz w:val="20"/>
         </w:rPr>
-        <w:t xml:space="preserve">. There are no other accepted symbols for the shape parameters </w:t>
+        <w:t xml:space="preserve">. There are no other accepted </w:t>
+      </w:r>
+      <w:r>
+        <w:rPr>
+          <w:i/>
+          <w:iCs/>
+          <w:color w:val="000000"/>
+          <w:sz w:val="20"/>
+        </w:rPr>
+        <w:t>letters</w:t>
+      </w:r>
+      <w:r>
+        <w:rPr>
+          <w:i/>
+          <w:iCs/>
+          <w:color w:val="000000"/>
+          <w:sz w:val="20"/>
+        </w:rPr>
+        <w:t xml:space="preserve"> for the shape parameters </w:t>
       </w:r>
       <w:r>
         <w:rPr>
@@ -2316,7 +2521,34 @@
           <w:color w:val="000000"/>
           <w:sz w:val="20"/>
         </w:rPr>
-        <w:t xml:space="preserve">, or for the mean, </w:t>
+        <w:t>, or for the mean</w:t>
+      </w:r>
+      <w:r>
+        <w:rPr>
+          <w:i/>
+          <w:iCs/>
+          <w:color w:val="000000"/>
+          <w:sz w:val="20"/>
+        </w:rPr>
+        <w:t xml:space="preserve"> </w:t>
+      </w:r>
+      <w:r>
+        <w:rPr>
+          <w:i/>
+          <w:iCs/>
+          <w:color w:val="000000"/>
+          <w:sz w:val="20"/>
+        </w:rPr>
+        <w:t>μ</w:t>
+      </w:r>
+      <w:r>
+        <w:rPr>
+          <w:i/>
+          <w:iCs/>
+          <w:color w:val="000000"/>
+          <w:sz w:val="20"/>
+        </w:rPr>
+        <w:t xml:space="preserve">, </w:t>
       </w:r>
       <w:proofErr w:type="spellStart"/>
       <w:r>
@@ -2336,7 +2568,62 @@
           <w:color w:val="000000"/>
           <w:sz w:val="20"/>
         </w:rPr>
-        <w:t xml:space="preserve">, variance etc. In each case I take care to avoid confusion by redefining what I mean in the given context (e.g. “the sample mean </w:t>
+        <w:t xml:space="preserve"> </w:t>
+      </w:r>
+      <w:r>
+        <w:rPr>
+          <w:i/>
+          <w:iCs/>
+          <w:color w:val="000000"/>
+          <w:sz w:val="20"/>
+        </w:rPr>
+        <w:t>σ</w:t>
+      </w:r>
+      <w:r>
+        <w:rPr>
+          <w:i/>
+          <w:iCs/>
+          <w:color w:val="000000"/>
+          <w:sz w:val="20"/>
+        </w:rPr>
+        <w:t>, variance</w:t>
+      </w:r>
+      <w:r>
+        <w:rPr>
+          <w:i/>
+          <w:iCs/>
+          <w:color w:val="000000"/>
+          <w:sz w:val="20"/>
+        </w:rPr>
+        <w:t xml:space="preserve"> </w:t>
+      </w:r>
+      <w:r>
+        <w:rPr>
+          <w:i/>
+          <w:iCs/>
+          <w:color w:val="000000"/>
+          <w:sz w:val="20"/>
+        </w:rPr>
+        <w:t>σ</w:t>
+      </w:r>
+      <w:r>
+        <w:rPr>
+          <w:i/>
+          <w:iCs/>
+          <w:color w:val="000000"/>
+          <w:sz w:val="20"/>
+          <w:vertAlign w:val="superscript"/>
+        </w:rPr>
+        <w:t>2</w:t>
+      </w:r>
+      <w:r>
+        <w:rPr>
+          <w:i/>
+          <w:iCs/>
+          <w:color w:val="000000"/>
+          <w:sz w:val="20"/>
+        </w:rPr>
+        <w:t xml:space="preserve"> etc. In each case I take care to avoid confusion by redefining what I mean in the given context (e.g. “the sample mean </w:t>
       </w:r>
       <w:r>
         <w:rPr>
@@ -2585,12 +2872,28 @@
         </w:rPr>
         <w:t xml:space="preserve"> in </w:t>
       </w:r>
-      <w:r>
-        <w:rPr>
-          <w:color w:val="000000"/>
-          <w:sz w:val="20"/>
-        </w:rPr>
-        <w:t>Statistical model</w:t>
+      <w:proofErr w:type="gramStart"/>
+      <w:r>
+        <w:rPr>
+          <w:color w:val="000000"/>
+          <w:sz w:val="20"/>
+        </w:rPr>
+        <w:t>The</w:t>
+      </w:r>
+      <w:proofErr w:type="gramEnd"/>
+      <w:r>
+        <w:rPr>
+          <w:color w:val="000000"/>
+          <w:sz w:val="20"/>
+        </w:rPr>
+        <w:t xml:space="preserve"> s</w:t>
+      </w:r>
+      <w:r>
+        <w:rPr>
+          <w:color w:val="000000"/>
+          <w:sz w:val="20"/>
+        </w:rPr>
+        <w:t>tatistical model</w:t>
       </w:r>
       <w:r>
         <w:rPr>
@@ -2816,7 +3119,25 @@
           <w:color w:val="000000"/>
           <w:sz w:val="20"/>
         </w:rPr>
-        <w:t>. An initial test comparison is in Table S4. I then fit the conventional model (e</w:t>
+        <w:t xml:space="preserve">. An initial test comparison is </w:t>
+      </w:r>
+      <w:r>
+        <w:rPr>
+          <w:i/>
+          <w:iCs/>
+          <w:color w:val="000000"/>
+          <w:sz w:val="20"/>
+        </w:rPr>
+        <w:t xml:space="preserve">provided </w:t>
+      </w:r>
+      <w:r>
+        <w:rPr>
+          <w:i/>
+          <w:iCs/>
+          <w:color w:val="000000"/>
+          <w:sz w:val="20"/>
+        </w:rPr>
+        <w:t>in Table S4. I then fit the conventional model (e</w:t>
       </w:r>
       <w:r>
         <w:rPr>
@@ -2986,7 +3307,43 @@
           <w:color w:val="000000"/>
           <w:sz w:val="20"/>
         </w:rPr>
-        <w:t>I now use a measurement error model to avoid simulating data.</w:t>
+        <w:t>I now use a measurement error model to avoid simulating data</w:t>
+      </w:r>
+      <w:r>
+        <w:rPr>
+          <w:i/>
+          <w:iCs/>
+          <w:color w:val="000000"/>
+          <w:sz w:val="20"/>
+        </w:rPr>
+        <w:t xml:space="preserve"> in the case of Brouwer (1996) and received raw data </w:t>
+      </w:r>
+      <w:r>
+        <w:rPr>
+          <w:i/>
+          <w:iCs/>
+          <w:color w:val="000000"/>
+          <w:sz w:val="20"/>
+        </w:rPr>
+        <w:t xml:space="preserve">from the authors of the remaining studies </w:t>
+      </w:r>
+      <w:r>
+        <w:rPr>
+          <w:i/>
+          <w:iCs/>
+          <w:color w:val="000000"/>
+          <w:sz w:val="20"/>
+        </w:rPr>
+        <w:t>upon renewed request</w:t>
+      </w:r>
+      <w:r>
+        <w:rPr>
+          <w:i/>
+          <w:iCs/>
+          <w:color w:val="000000"/>
+          <w:sz w:val="20"/>
+        </w:rPr>
+        <w:t>.</w:t>
       </w:r>
     </w:p>
     <w:p>
@@ -3056,16 +3413,52 @@
           <w:color w:val="000000"/>
           <w:sz w:val="20"/>
         </w:rPr>
-        <w:t>See rewording of ecological interpretation of µ above.</w:t>
-      </w:r>
-      <w:r>
-        <w:rPr>
-          <w:i/>
-          <w:iCs/>
-          <w:color w:val="000000"/>
-          <w:sz w:val="20"/>
-        </w:rPr>
-        <w:t xml:space="preserve"> I added the requested figure captions.</w:t>
+        <w:t xml:space="preserve">See </w:t>
+      </w:r>
+      <w:r>
+        <w:rPr>
+          <w:i/>
+          <w:iCs/>
+          <w:color w:val="000000"/>
+          <w:sz w:val="20"/>
+        </w:rPr>
+        <w:t>comment on the interpretability</w:t>
+      </w:r>
+      <w:r>
+        <w:rPr>
+          <w:i/>
+          <w:iCs/>
+          <w:color w:val="000000"/>
+          <w:sz w:val="20"/>
+        </w:rPr>
+        <w:t xml:space="preserve"> of µ above.</w:t>
+      </w:r>
+      <w:r>
+        <w:rPr>
+          <w:i/>
+          <w:iCs/>
+          <w:color w:val="000000"/>
+          <w:sz w:val="20"/>
+        </w:rPr>
+        <w:t xml:space="preserve"> I added the requested</w:t>
+      </w:r>
+      <w:r>
+        <w:rPr>
+          <w:i/>
+          <w:iCs/>
+          <w:color w:val="000000"/>
+          <w:sz w:val="20"/>
+        </w:rPr>
+        <w:t xml:space="preserve"> detail in the</w:t>
+      </w:r>
+      <w:r>
+        <w:rPr>
+          <w:i/>
+          <w:iCs/>
+          <w:color w:val="000000"/>
+          <w:sz w:val="20"/>
+        </w:rPr>
+        <w:t xml:space="preserve"> figure captions.</w:t>
       </w:r>
     </w:p>
     <w:p>
@@ -3120,16 +3513,70 @@
           <w:color w:val="000000"/>
           <w:sz w:val="20"/>
         </w:rPr>
-        <w:t xml:space="preserve">As far as I know there is no long-term seaweed sequestration. </w:t>
-      </w:r>
-      <w:r>
-        <w:rPr>
-          <w:i/>
-          <w:iCs/>
-          <w:color w:val="000000"/>
-          <w:sz w:val="20"/>
-        </w:rPr>
-        <w:t xml:space="preserve">I only use </w:t>
+        <w:t xml:space="preserve">As far as I know there is no long-term seaweed </w:t>
+      </w:r>
+      <w:r>
+        <w:rPr>
+          <w:i/>
+          <w:iCs/>
+          <w:color w:val="000000"/>
+          <w:sz w:val="20"/>
+        </w:rPr>
+        <w:t xml:space="preserve">carbon </w:t>
+      </w:r>
+      <w:r>
+        <w:rPr>
+          <w:i/>
+          <w:iCs/>
+          <w:color w:val="000000"/>
+          <w:sz w:val="20"/>
+        </w:rPr>
+        <w:t>sequestration</w:t>
+      </w:r>
+      <w:r>
+        <w:rPr>
+          <w:i/>
+          <w:iCs/>
+          <w:color w:val="000000"/>
+          <w:sz w:val="20"/>
+        </w:rPr>
+        <w:t xml:space="preserve"> independent of the detrital pool. As I explain in the introduction, only seaweed detritus may be buried as allochthonous carbon</w:t>
+      </w:r>
+      <w:r>
+        <w:rPr>
+          <w:i/>
+          <w:iCs/>
+          <w:color w:val="000000"/>
+          <w:sz w:val="20"/>
+        </w:rPr>
+        <w:t xml:space="preserve">. </w:t>
+      </w:r>
+      <w:r>
+        <w:rPr>
+          <w:i/>
+          <w:iCs/>
+          <w:color w:val="000000"/>
+          <w:sz w:val="20"/>
+        </w:rPr>
+        <w:t xml:space="preserve">I </w:t>
+      </w:r>
+      <w:r>
+        <w:rPr>
+          <w:i/>
+          <w:iCs/>
+          <w:color w:val="000000"/>
+          <w:sz w:val="20"/>
+        </w:rPr>
+        <w:t>solely</w:t>
+      </w:r>
+      <w:r>
+        <w:rPr>
+          <w:i/>
+          <w:iCs/>
+          <w:color w:val="000000"/>
+          <w:sz w:val="20"/>
+        </w:rPr>
+        <w:t xml:space="preserve"> use </w:t>
       </w:r>
       <w:r>
         <w:rPr>
@@ -3174,27 +3621,52 @@
           <w:color w:val="000000"/>
           <w:sz w:val="20"/>
         </w:rPr>
-        <w:t xml:space="preserve"> and make conclusions about decomposition having implications for estimates of seaweed blue carbon which </w:t>
-      </w:r>
-      <w:proofErr w:type="gramStart"/>
-      <w:r>
-        <w:rPr>
-          <w:i/>
-          <w:iCs/>
-          <w:color w:val="000000"/>
-          <w:sz w:val="20"/>
-        </w:rPr>
-        <w:t>by definition hinges</w:t>
-      </w:r>
-      <w:proofErr w:type="gramEnd"/>
-      <w:r>
-        <w:rPr>
-          <w:i/>
-          <w:iCs/>
-          <w:color w:val="000000"/>
-          <w:sz w:val="20"/>
-        </w:rPr>
-        <w:t xml:space="preserve"> on the detrital pool.</w:t>
+        <w:t xml:space="preserve">. My </w:t>
+      </w:r>
+      <w:r>
+        <w:rPr>
+          <w:i/>
+          <w:iCs/>
+          <w:color w:val="000000"/>
+          <w:sz w:val="20"/>
+        </w:rPr>
+        <w:t>conclusions</w:t>
+      </w:r>
+      <w:r>
+        <w:rPr>
+          <w:i/>
+          <w:iCs/>
+          <w:color w:val="000000"/>
+          <w:sz w:val="20"/>
+        </w:rPr>
+        <w:t xml:space="preserve"> relate to</w:t>
+      </w:r>
+      <w:r>
+        <w:rPr>
+          <w:i/>
+          <w:iCs/>
+          <w:color w:val="000000"/>
+          <w:sz w:val="20"/>
+        </w:rPr>
+        <w:t xml:space="preserve"> decomposition </w:t>
+      </w:r>
+      <w:r>
+        <w:rPr>
+          <w:i/>
+          <w:iCs/>
+          <w:color w:val="000000"/>
+          <w:sz w:val="20"/>
+        </w:rPr>
+        <w:t>affecting</w:t>
+      </w:r>
+      <w:r>
+        <w:rPr>
+          <w:i/>
+          <w:iCs/>
+          <w:color w:val="000000"/>
+          <w:sz w:val="20"/>
+        </w:rPr>
+        <w:t xml:space="preserve"> estimates of seaweed blue carbon.</w:t>
       </w:r>
     </w:p>
     <w:p>
@@ -3314,7 +3786,34 @@
           <w:color w:val="000000"/>
           <w:sz w:val="20"/>
         </w:rPr>
-        <w:t xml:space="preserve"> DOI.</w:t>
+        <w:t xml:space="preserve"> DOI</w:t>
+      </w:r>
+      <w:r>
+        <w:rPr>
+          <w:i/>
+          <w:iCs/>
+          <w:color w:val="000000"/>
+          <w:sz w:val="20"/>
+        </w:rPr>
+        <w:t xml:space="preserve">: </w:t>
+      </w:r>
+      <w:r>
+        <w:rPr>
+          <w:i/>
+          <w:iCs/>
+          <w:color w:val="000000"/>
+          <w:sz w:val="20"/>
+        </w:rPr>
+        <w:t>https://doi.org/10.5281/zenodo.18654199</w:t>
+      </w:r>
+      <w:r>
+        <w:rPr>
+          <w:i/>
+          <w:iCs/>
+          <w:color w:val="000000"/>
+          <w:sz w:val="20"/>
+        </w:rPr>
+        <w:t>.</w:t>
       </w:r>
     </w:p>
     <w:p>
@@ -3516,7 +4015,25 @@
           <w:color w:val="000000"/>
           <w:sz w:val="20"/>
         </w:rPr>
-        <w:t xml:space="preserve"> and accept style suggestions</w:t>
+        <w:t xml:space="preserve"> and accept </w:t>
+      </w:r>
+      <w:r>
+        <w:rPr>
+          <w:i/>
+          <w:iCs/>
+          <w:color w:val="000000"/>
+          <w:sz w:val="20"/>
+        </w:rPr>
+        <w:t xml:space="preserve">your </w:t>
+      </w:r>
+      <w:r>
+        <w:rPr>
+          <w:i/>
+          <w:iCs/>
+          <w:color w:val="000000"/>
+          <w:sz w:val="20"/>
+        </w:rPr>
+        <w:t>style suggestions</w:t>
       </w:r>
       <w:r>
         <w:rPr>
@@ -5398,6 +5915,16 @@
 </file>
 
 <file path=customXml/item1.xml><?xml version="1.0" encoding="utf-8"?>
+<b:Sources xmlns:b="http://schemas.openxmlformats.org/officeDocument/2006/bibliography" xmlns="http://schemas.openxmlformats.org/officeDocument/2006/bibliography" SelectedStyle="\APA.XSL" StyleName="APA"/>
+</file>
+
+<file path=customXml/item2.xml><?xml version="1.0" encoding="utf-8"?>
+<p:properties xmlns:p="http://schemas.microsoft.com/office/2006/metadata/properties" xmlns:xsi="http://www.w3.org/2001/XMLSchema-instance" xmlns:pc="http://schemas.microsoft.com/office/infopath/2007/PartnerControls">
+  <documentManagement/>
+</p:properties>
+</file>
+
+<file path=customXml/item3.xml><?xml version="1.0" encoding="utf-8"?>
 <?mso-contentType ?>
 <FormTemplates xmlns="http://schemas.microsoft.com/sharepoint/v3/contenttype/forms">
   <Display>DocumentLibraryForm</Display>
@@ -5406,7 +5933,7 @@
 </FormTemplates>
 </file>
 
-<file path=customXml/item2.xml><?xml version="1.0" encoding="utf-8"?>
+<file path=customXml/item4.xml><?xml version="1.0" encoding="utf-8"?>
 <ct:contentTypeSchema xmlns:ct="http://schemas.microsoft.com/office/2006/metadata/contentType" xmlns:ma="http://schemas.microsoft.com/office/2006/metadata/properties/metaAttributes" ct:_="" ma:_="" ma:contentTypeName="Document" ma:contentTypeID="0x010100F506C62138D5754EA41BA4DC19A1E407" ma:contentTypeVersion="11" ma:contentTypeDescription="Create a new document." ma:contentTypeScope="" ma:versionID="533f23a058946b210d2393eef0e401f1">
   <xsd:schema xmlns:xsd="http://www.w3.org/2001/XMLSchema" xmlns:xs="http://www.w3.org/2001/XMLSchema" xmlns:p="http://schemas.microsoft.com/office/2006/metadata/properties" xmlns:ns3="bca5432e-c0ba-41ff-bf15-2948da11e02b" xmlns:ns4="19882bb7-d337-499c-92d8-e4c0858a3aef" targetNamespace="http://schemas.microsoft.com/office/2006/metadata/properties" ma:root="true" ma:fieldsID="519b6e3ff2d60599a10c0e02a977b21c" ns3:_="" ns4:_="">
     <xsd:import namespace="bca5432e-c0ba-41ff-bf15-2948da11e02b"/>
@@ -5615,17 +6142,24 @@
 </ct:contentTypeSchema>
 </file>
 
-<file path=customXml/item3.xml><?xml version="1.0" encoding="utf-8"?>
-<b:Sources xmlns:b="http://schemas.openxmlformats.org/officeDocument/2006/bibliography" xmlns="http://schemas.openxmlformats.org/officeDocument/2006/bibliography" SelectedStyle="\APA.XSL" StyleName="APA"/>
+<file path=customXml/itemProps1.xml><?xml version="1.0" encoding="utf-8"?>
+<ds:datastoreItem xmlns:ds="http://schemas.openxmlformats.org/officeDocument/2006/customXml" ds:itemID="{EF3FC06B-A1C7-4903-942E-5FC3CA880079}">
+  <ds:schemaRefs>
+    <ds:schemaRef ds:uri="http://schemas.openxmlformats.org/officeDocument/2006/bibliography"/>
+  </ds:schemaRefs>
+</ds:datastoreItem>
 </file>
 
-<file path=customXml/item4.xml><?xml version="1.0" encoding="utf-8"?>
-<p:properties xmlns:p="http://schemas.microsoft.com/office/2006/metadata/properties" xmlns:xsi="http://www.w3.org/2001/XMLSchema-instance" xmlns:pc="http://schemas.microsoft.com/office/infopath/2007/PartnerControls">
-  <documentManagement/>
-</p:properties>
+<file path=customXml/itemProps2.xml><?xml version="1.0" encoding="utf-8"?>
+<ds:datastoreItem xmlns:ds="http://schemas.openxmlformats.org/officeDocument/2006/customXml" ds:itemID="{7D8DDF7F-2540-4B73-8B67-8A8AE210C1E4}">
+  <ds:schemaRefs>
+    <ds:schemaRef ds:uri="http://schemas.microsoft.com/office/2006/metadata/properties"/>
+    <ds:schemaRef ds:uri="http://schemas.microsoft.com/office/infopath/2007/PartnerControls"/>
+  </ds:schemaRefs>
+</ds:datastoreItem>
 </file>
 
-<file path=customXml/itemProps1.xml><?xml version="1.0" encoding="utf-8"?>
+<file path=customXml/itemProps3.xml><?xml version="1.0" encoding="utf-8"?>
 <ds:datastoreItem xmlns:ds="http://schemas.openxmlformats.org/officeDocument/2006/customXml" ds:itemID="{05D64467-C30F-462B-B48B-8715BD1536B7}">
   <ds:schemaRefs>
     <ds:schemaRef ds:uri="http://schemas.microsoft.com/sharepoint/v3/contenttype/forms"/>
@@ -5633,7 +6167,7 @@
 </ds:datastoreItem>
 </file>
 
-<file path=customXml/itemProps2.xml><?xml version="1.0" encoding="utf-8"?>
+<file path=customXml/itemProps4.xml><?xml version="1.0" encoding="utf-8"?>
 <ds:datastoreItem xmlns:ds="http://schemas.openxmlformats.org/officeDocument/2006/customXml" ds:itemID="{8042E842-244E-4582-A2E3-246581E34E48}">
   <ds:schemaRefs>
     <ds:schemaRef ds:uri="http://schemas.microsoft.com/office/2006/metadata/contentType"/>
@@ -5650,21 +6184,4 @@
     <ds:schemaRef ds:uri="http://schemas.microsoft.com/internal/obd"/>
   </ds:schemaRefs>
 </ds:datastoreItem>
-</file>
-
-<file path=customXml/itemProps3.xml><?xml version="1.0" encoding="utf-8"?>
-<ds:datastoreItem xmlns:ds="http://schemas.openxmlformats.org/officeDocument/2006/customXml" ds:itemID="{EF3FC06B-A1C7-4903-942E-5FC3CA880079}">
-  <ds:schemaRefs>
-    <ds:schemaRef ds:uri="http://schemas.openxmlformats.org/officeDocument/2006/bibliography"/>
-  </ds:schemaRefs>
-</ds:datastoreItem>
-</file>
-
-<file path=customXml/itemProps4.xml><?xml version="1.0" encoding="utf-8"?>
-<ds:datastoreItem xmlns:ds="http://schemas.openxmlformats.org/officeDocument/2006/customXml" ds:itemID="{7D8DDF7F-2540-4B73-8B67-8A8AE210C1E4}">
-  <ds:schemaRefs>
-    <ds:schemaRef ds:uri="http://schemas.microsoft.com/office/2006/metadata/properties"/>
-    <ds:schemaRef ds:uri="http://schemas.microsoft.com/office/infopath/2007/PartnerControls"/>
-  </ds:schemaRefs>
-</ds:datastoreItem>
 </file>
</xml_diff>